<commit_message>
Add initial implementation of lexer, parser, and main compiler logic; create documentation files
</commit_message>
<xml_diff>
--- a/Documentation/MPPL Spec Doc.docx
+++ b/Documentation/MPPL Spec Doc.docx
@@ -8,15 +8,7 @@
       </w:pPr>
       <w:bookmarkStart w:id="0" w:name="X6c64561fdc0b3892feb3420574c3e9c0fff6d9e"/>
       <w:r>
-        <w:t xml:space="preserve">Multi-Purpose Programming Language (MPPL or </w:t>
-      </w:r>
-      <w:proofErr w:type="spellStart"/>
-      <w:r>
-        <w:t>Mapple</w:t>
-      </w:r>
-      <w:proofErr w:type="spellEnd"/>
-      <w:r>
-        <w:t>) Roadmap &amp; Identity Specification (v0.1)</w:t>
+        <w:t>Multi-Purpose Programming Language (MPPL or Mapple) Roadmap &amp; Identity Specification (v0.1)</w:t>
       </w:r>
     </w:p>
     <w:p>
@@ -144,11 +136,7 @@
         </w:numPr>
       </w:pPr>
       <w:r>
-        <w:t xml:space="preserve">Classes end with double semicolons </w:t>
-      </w:r>
-      <w:proofErr w:type="gramStart"/>
-      <w:r>
-        <w:t>(</w:t>
+        <w:t>Classes end with double semicolons (</w:t>
       </w:r>
       <w:r>
         <w:rPr>
@@ -157,11 +145,7 @@
         <w:t>;;</w:t>
       </w:r>
       <w:r>
-        <w:t>)</w:t>
-      </w:r>
-      <w:proofErr w:type="gramEnd"/>
-      <w:r>
-        <w:t>.</w:t>
+        <w:t>).</w:t>
       </w:r>
     </w:p>
     <w:p>
@@ -205,16 +189,8 @@
         <w:rPr>
           <w:rStyle w:val="VerbatimChar"/>
         </w:rPr>
-        <w:t xml:space="preserve">class </w:t>
-      </w:r>
-      <w:proofErr w:type="gramStart"/>
-      <w:r>
-        <w:rPr>
-          <w:rStyle w:val="VerbatimChar"/>
-        </w:rPr>
-        <w:t>ClassName::</w:t>
-      </w:r>
-      <w:proofErr w:type="gramEnd"/>
+        <w:t>class ClassName::</w:t>
+      </w:r>
       <w:r>
         <w:br/>
       </w:r>
@@ -246,27 +222,17 @@
         <w:rPr>
           <w:rStyle w:val="VerbatimChar"/>
         </w:rPr>
-        <w:t xml:space="preserve">  </w:t>
-      </w:r>
-      <w:proofErr w:type="gramStart"/>
-      <w:r>
-        <w:rPr>
-          <w:rStyle w:val="VerbatimChar"/>
-        </w:rPr>
-        <w:t xml:space="preserve">  ;</w:t>
-      </w:r>
-      <w:proofErr w:type="gramEnd"/>
+        <w:t xml:space="preserve">    ;</w:t>
+      </w:r>
       <w:r>
         <w:br/>
       </w:r>
-      <w:proofErr w:type="gramStart"/>
       <w:r>
         <w:rPr>
           <w:rStyle w:val="VerbatimChar"/>
         </w:rPr>
         <w:t>;;</w:t>
       </w:r>
-      <w:proofErr w:type="gramEnd"/>
     </w:p>
     <w:p>
       <w:pPr>
@@ -503,36 +469,20 @@
       <w:r>
         <w:t xml:space="preserve"> </w:t>
       </w:r>
-      <w:proofErr w:type="gramStart"/>
-      <w:r>
-        <w:rPr>
-          <w:rStyle w:val="VerbatimChar"/>
-        </w:rPr>
-        <w:t>input(</w:t>
-      </w:r>
-      <w:proofErr w:type="gramEnd"/>
-      <w:r>
-        <w:rPr>
-          <w:rStyle w:val="VerbatimChar"/>
-        </w:rPr>
-        <w:t>) and</w:t>
+      <w:r>
+        <w:rPr>
+          <w:rStyle w:val="VerbatimChar"/>
+        </w:rPr>
+        <w:t>input() and</w:t>
       </w:r>
       <w:r>
         <w:t xml:space="preserve"> </w:t>
       </w:r>
-      <w:proofErr w:type="gramStart"/>
-      <w:r>
-        <w:rPr>
-          <w:rStyle w:val="VerbatimChar"/>
-        </w:rPr>
-        <w:t>print(</w:t>
-      </w:r>
-      <w:proofErr w:type="gramEnd"/>
-      <w:r>
-        <w:rPr>
-          <w:rStyle w:val="VerbatimChar"/>
-        </w:rPr>
-        <w:t>)</w:t>
+      <w:r>
+        <w:rPr>
+          <w:rStyle w:val="VerbatimChar"/>
+        </w:rPr>
+        <w:t>print()</w:t>
       </w:r>
       <w:r>
         <w:t xml:space="preserve"> function.</w:t>
@@ -587,15 +537,7 @@
         <w:t>Global scripts:</w:t>
       </w:r>
       <w:r>
-        <w:t xml:space="preserve"> Code outside functions/classes </w:t>
-      </w:r>
-      <w:proofErr w:type="gramStart"/>
-      <w:r>
-        <w:t>executes</w:t>
-      </w:r>
-      <w:proofErr w:type="gramEnd"/>
-      <w:r>
-        <w:t xml:space="preserve"> immediately.</w:t>
+        <w:t xml:space="preserve"> Code outside functions/classes executes immediately.</w:t>
       </w:r>
     </w:p>
     <w:p>
@@ -617,19 +559,11 @@
         </w:rPr>
         <w:t xml:space="preserve">let int x = </w:t>
       </w:r>
-      <w:proofErr w:type="gramStart"/>
-      <w:r>
-        <w:rPr>
-          <w:rStyle w:val="VerbatimChar"/>
-        </w:rPr>
-        <w:t>input(</w:t>
-      </w:r>
-      <w:proofErr w:type="gramEnd"/>
-      <w:r>
-        <w:rPr>
-          <w:rStyle w:val="VerbatimChar"/>
-        </w:rPr>
-        <w:t>)</w:t>
+      <w:r>
+        <w:rPr>
+          <w:rStyle w:val="VerbatimChar"/>
+        </w:rPr>
+        <w:t>input()</w:t>
       </w:r>
       <w:r>
         <w:rPr>
@@ -646,19 +580,11 @@
       <w:r>
         <w:br/>
       </w:r>
-      <w:proofErr w:type="gramStart"/>
-      <w:r>
-        <w:rPr>
-          <w:rStyle w:val="VerbatimChar"/>
-        </w:rPr>
-        <w:t>print(</w:t>
-      </w:r>
-      <w:proofErr w:type="gramEnd"/>
-      <w:r>
-        <w:rPr>
-          <w:rStyle w:val="VerbatimChar"/>
-        </w:rPr>
-        <w:t>x + 2); // executes immediately</w:t>
+      <w:r>
+        <w:rPr>
+          <w:rStyle w:val="VerbatimChar"/>
+        </w:rPr>
+        <w:t>print(x + 2); // executes immediately</w:t>
       </w:r>
     </w:p>
     <w:p>
@@ -681,28 +607,7 @@
           <w:rStyle w:val="VerbatimChar"/>
         </w:rPr>
         <w:lastRenderedPageBreak/>
-        <w:t xml:space="preserve">//calling </w:t>
-      </w:r>
-      <w:proofErr w:type="gramStart"/>
-      <w:r>
-        <w:rPr>
-          <w:rStyle w:val="VerbatimChar"/>
-        </w:rPr>
-        <w:t>input(</w:t>
-      </w:r>
-      <w:proofErr w:type="gramEnd"/>
-      <w:r>
-        <w:rPr>
-          <w:rStyle w:val="VerbatimChar"/>
-        </w:rPr>
-        <w:t xml:space="preserve">) lets you input a value from CLI (command line interface), you could add a string comment which will be printed in the prompt. Input is only used when initializing or assigning a value to a variable. You specify the data type being assigned when inputting by using </w:t>
-      </w:r>
-      <w:proofErr w:type="gramStart"/>
-      <w:r>
-        <w:rPr>
-          <w:rStyle w:val="VerbatimChar"/>
-        </w:rPr>
-        <w:t>“</w:t>
+        <w:t>//calling input() lets you input a value from CLI (command line interface), you could add a string comment which will be printed in the prompt. Input is only used when initializing or assigning a value to a variable. You specify the data type being assigned when inputting by using “</w:t>
       </w:r>
       <w:r>
         <w:rPr>
@@ -714,28 +619,7 @@
         <w:rPr>
           <w:rStyle w:val="VerbatimChar"/>
         </w:rPr>
-        <w:t>.</w:t>
-      </w:r>
-      <w:proofErr w:type="gramEnd"/>
-      <w:r>
-        <w:rPr>
-          <w:rStyle w:val="VerbatimChar"/>
-        </w:rPr>
-        <w:t xml:space="preserve">&lt;data type&gt; “behind </w:t>
-      </w:r>
-      <w:proofErr w:type="gramStart"/>
-      <w:r>
-        <w:rPr>
-          <w:rStyle w:val="VerbatimChar"/>
-        </w:rPr>
-        <w:t>input(</w:t>
-      </w:r>
-      <w:proofErr w:type="gramEnd"/>
-      <w:r>
-        <w:rPr>
-          <w:rStyle w:val="VerbatimChar"/>
-        </w:rPr>
-        <w:t xml:space="preserve">). </w:t>
+        <w:t xml:space="preserve">.&lt;data type&gt; “behind input(). </w:t>
       </w:r>
     </w:p>
     <w:p>
@@ -764,35 +648,7 @@
           <w:rStyle w:val="VerbatimChar"/>
         </w:rPr>
         <w:tab/>
-        <w:t xml:space="preserve">let str name = </w:t>
-      </w:r>
-      <w:proofErr w:type="gramStart"/>
-      <w:r>
-        <w:rPr>
-          <w:rStyle w:val="VerbatimChar"/>
-        </w:rPr>
-        <w:t>input(</w:t>
-      </w:r>
-      <w:proofErr w:type="gramEnd"/>
-      <w:r>
-        <w:rPr>
-          <w:rStyle w:val="VerbatimChar"/>
-        </w:rPr>
-        <w:t>“Enter your name”).</w:t>
-      </w:r>
-      <w:proofErr w:type="gramStart"/>
-      <w:r>
-        <w:rPr>
-          <w:rStyle w:val="VerbatimChar"/>
-        </w:rPr>
-        <w:t>str ;</w:t>
-      </w:r>
-      <w:proofErr w:type="gramEnd"/>
-      <w:r>
-        <w:rPr>
-          <w:rStyle w:val="VerbatimChar"/>
-        </w:rPr>
-        <w:t xml:space="preserve"> </w:t>
+        <w:t xml:space="preserve">let str name = input(“Enter your name”).str ; </w:t>
       </w:r>
     </w:p>
     <w:p>
@@ -820,21 +676,8 @@
       <w:pPr>
         <w:pStyle w:val="SourceCode"/>
       </w:pPr>
-      <w:proofErr w:type="gramStart"/>
-      <w:r>
-        <w:t>print(</w:t>
-      </w:r>
-      <w:proofErr w:type="gramEnd"/>
-      <w:r>
-        <w:t>"Score: " + 100</w:t>
-      </w:r>
-      <w:proofErr w:type="gramStart"/>
-      <w:r>
-        <w:t>);</w:t>
-      </w:r>
-      <w:proofErr w:type="gramEnd"/>
-      <w:r>
-        <w:t> </w:t>
+      <w:r>
+        <w:t>print("Score: " + 100); </w:t>
       </w:r>
     </w:p>
     <w:p>
@@ -879,7 +722,6 @@
       <w:r>
         <w:t xml:space="preserve"> </w:t>
       </w:r>
-      <w:proofErr w:type="gramStart"/>
       <w:r>
         <w:t xml:space="preserve">input(), </w:t>
       </w:r>
@@ -890,28 +732,13 @@
         <w:rPr>
           <w:rStyle w:val="VerbatimChar"/>
         </w:rPr>
-        <w:t>print</w:t>
-      </w:r>
-      <w:proofErr w:type="gramEnd"/>
-      <w:r>
-        <w:rPr>
-          <w:rStyle w:val="VerbatimChar"/>
-        </w:rPr>
-        <w:t>()</w:t>
-      </w:r>
-      <w:r>
-        <w:t xml:space="preserve">, basic math </w:t>
-      </w:r>
-      <w:proofErr w:type="gramStart"/>
-      <w:r>
-        <w:t>functions</w:t>
-      </w:r>
-      <w:r>
-        <w:t>(</w:t>
-      </w:r>
-      <w:proofErr w:type="gramEnd"/>
-      <w:r>
-        <w:t>addition, subtraction, division and multiplication)</w:t>
+        <w:t>print()</w:t>
+      </w:r>
+      <w:r>
+        <w:t>, basic math functions</w:t>
+      </w:r>
+      <w:r>
+        <w:t>(addition, subtraction, division and multiplication)</w:t>
       </w:r>
       <w:r>
         <w:t>.</w:t>
@@ -986,23 +813,7 @@
         <w:t xml:space="preserve"> </w:t>
       </w:r>
       <w:r>
-        <w:t xml:space="preserve">print function is available, especially in cases </w:t>
-      </w:r>
-      <w:proofErr w:type="gramStart"/>
-      <w:r>
-        <w:t>were</w:t>
-      </w:r>
-      <w:proofErr w:type="gramEnd"/>
-      <w:r>
-        <w:t xml:space="preserve"> </w:t>
-      </w:r>
-      <w:proofErr w:type="gramStart"/>
-      <w:r>
-        <w:t>user</w:t>
-      </w:r>
-      <w:proofErr w:type="gramEnd"/>
-      <w:r>
-        <w:t xml:space="preserve"> would try to use implicit type conversion. </w:t>
+        <w:t xml:space="preserve">print function is available, especially in cases were user would try to use implicit type conversion. </w:t>
       </w:r>
     </w:p>
     <w:p>
@@ -1322,13 +1133,8 @@
         <w:t>Implicit t</w:t>
       </w:r>
       <w:r>
-        <w:t xml:space="preserve">ype conversion is not possible in version </w:t>
-      </w:r>
-      <w:proofErr w:type="gramStart"/>
-      <w:r>
-        <w:t>0.1</w:t>
-      </w:r>
-      <w:proofErr w:type="gramEnd"/>
+        <w:t>ype conversion is not possible in version 0.1</w:t>
+      </w:r>
       <w:r>
         <w:t xml:space="preserve"> but explicit type conversion is possible for the input function.</w:t>
       </w:r>
@@ -1351,15 +1157,7 @@
         <w:pStyle w:val="BodyText"/>
       </w:pPr>
       <w:r>
-        <w:t xml:space="preserve">Double semicolons </w:t>
-      </w:r>
-      <w:proofErr w:type="gramStart"/>
-      <w:r>
-        <w:t>(;;)</w:t>
-      </w:r>
-      <w:proofErr w:type="gramEnd"/>
-      <w:r>
-        <w:t xml:space="preserve"> will be mandatory at the end of a class.</w:t>
+        <w:t>Double semicolons (;;) will be mandatory at the end of a class.</w:t>
       </w:r>
     </w:p>
     <w:p>
@@ -1382,16 +1180,8 @@
         <w:rPr>
           <w:rStyle w:val="VerbatimChar"/>
         </w:rPr>
-        <w:t>let &lt;type&gt; &lt;name</w:t>
-      </w:r>
-      <w:proofErr w:type="gramStart"/>
-      <w:r>
-        <w:rPr>
-          <w:rStyle w:val="VerbatimChar"/>
-        </w:rPr>
-        <w:t>&gt;;</w:t>
-      </w:r>
-      <w:proofErr w:type="gramEnd"/>
+        <w:t>let &lt;type&gt; &lt;name&gt;;</w:t>
+      </w:r>
     </w:p>
     <w:p>
       <w:pPr>
@@ -1408,16 +1198,8 @@
         <w:rPr>
           <w:rStyle w:val="VerbatimChar"/>
         </w:rPr>
-        <w:t>let &lt;type&gt; &lt;name&gt; = &lt;value</w:t>
-      </w:r>
-      <w:proofErr w:type="gramStart"/>
-      <w:r>
-        <w:rPr>
-          <w:rStyle w:val="VerbatimChar"/>
-        </w:rPr>
-        <w:t>&gt;;</w:t>
-      </w:r>
-      <w:proofErr w:type="gramEnd"/>
+        <w:t>let &lt;type&gt; &lt;name&gt; = &lt;value&gt;;</w:t>
+      </w:r>
     </w:p>
     <w:p>
       <w:pPr>
@@ -1442,16 +1224,8 @@
         <w:rPr>
           <w:rStyle w:val="VerbatimChar"/>
         </w:rPr>
-        <w:t xml:space="preserve">let int age = </w:t>
-      </w:r>
-      <w:proofErr w:type="gramStart"/>
-      <w:r>
-        <w:rPr>
-          <w:rStyle w:val="VerbatimChar"/>
-        </w:rPr>
-        <w:t>20;</w:t>
-      </w:r>
-      <w:proofErr w:type="gramEnd"/>
+        <w:t>let int age = 20;</w:t>
+      </w:r>
     </w:p>
     <w:p>
       <w:pPr>
@@ -1488,44 +1262,8 @@
         <w:rPr>
           <w:rStyle w:val="VerbatimChar"/>
         </w:rPr>
-        <w:t xml:space="preserve">let </w:t>
-      </w:r>
-      <w:proofErr w:type="spellStart"/>
-      <w:r>
-        <w:rPr>
-          <w:rStyle w:val="VerbatimChar"/>
-        </w:rPr>
-        <w:t>bool</w:t>
-      </w:r>
-      <w:proofErr w:type="spellEnd"/>
-      <w:r>
-        <w:rPr>
-          <w:rStyle w:val="VerbatimChar"/>
-        </w:rPr>
-        <w:t xml:space="preserve"> </w:t>
-      </w:r>
-      <w:proofErr w:type="spellStart"/>
-      <w:r>
-        <w:rPr>
-          <w:rStyle w:val="VerbatimChar"/>
-        </w:rPr>
-        <w:t>isActive</w:t>
-      </w:r>
-      <w:proofErr w:type="spellEnd"/>
-      <w:r>
-        <w:rPr>
-          <w:rStyle w:val="VerbatimChar"/>
-        </w:rPr>
-        <w:t xml:space="preserve"> = </w:t>
-      </w:r>
-      <w:proofErr w:type="gramStart"/>
-      <w:r>
-        <w:rPr>
-          <w:rStyle w:val="VerbatimChar"/>
-        </w:rPr>
-        <w:t>true;</w:t>
-      </w:r>
-      <w:proofErr w:type="gramEnd"/>
+        <w:t>let bool isActive = true;</w:t>
+      </w:r>
     </w:p>
     <w:p>
       <w:pPr>
@@ -1565,16 +1303,8 @@
         <w:rPr>
           <w:rStyle w:val="VerbatimChar"/>
         </w:rPr>
-        <w:t xml:space="preserve">isActive = </w:t>
-      </w:r>
-      <w:proofErr w:type="gramStart"/>
-      <w:r>
-        <w:rPr>
-          <w:rStyle w:val="VerbatimChar"/>
-        </w:rPr>
-        <w:t>false;</w:t>
-      </w:r>
-      <w:proofErr w:type="gramEnd"/>
+        <w:t>isActive = false;</w:t>
+      </w:r>
     </w:p>
     <w:p>
       <w:pPr>
@@ -1598,13 +1328,8 @@
           <w:numId w:val="11"/>
         </w:numPr>
       </w:pPr>
-      <w:proofErr w:type="gramStart"/>
-      <w:r>
-        <w:t>Single-line</w:t>
-      </w:r>
-      <w:proofErr w:type="gramEnd"/>
-      <w:r>
-        <w:t xml:space="preserve">: </w:t>
+      <w:r>
+        <w:t xml:space="preserve">Single-line: </w:t>
       </w:r>
       <w:r>
         <w:rPr>
@@ -1697,19 +1422,11 @@
       <w:r>
         <w:br/>
       </w:r>
-      <w:proofErr w:type="gramStart"/>
-      <w:r>
-        <w:rPr>
-          <w:rStyle w:val="VerbatimChar"/>
-        </w:rPr>
-        <w:t>print(</w:t>
-      </w:r>
-      <w:proofErr w:type="gramEnd"/>
-      <w:r>
-        <w:rPr>
-          <w:rStyle w:val="VerbatimChar"/>
-        </w:rPr>
-        <w:t>age + 5);</w:t>
+      <w:r>
+        <w:rPr>
+          <w:rStyle w:val="VerbatimChar"/>
+        </w:rPr>
+        <w:t>print(age + 5);</w:t>
       </w:r>
       <w:r>
         <w:br/>
@@ -1727,16 +1444,8 @@
         <w:rPr>
           <w:rStyle w:val="VerbatimChar"/>
         </w:rPr>
-        <w:t>print(isActive</w:t>
-      </w:r>
-      <w:proofErr w:type="gramStart"/>
-      <w:r>
-        <w:rPr>
-          <w:rStyle w:val="VerbatimChar"/>
-        </w:rPr>
-        <w:t>);</w:t>
-      </w:r>
-      <w:proofErr w:type="gramEnd"/>
+        <w:t>print(isActive);</w:t>
+      </w:r>
     </w:p>
     <w:p>
       <w:pPr>
@@ -1871,31 +1580,7 @@
         <w:t>Function Blocks</w:t>
       </w:r>
       <w:r>
-        <w:t xml:space="preserve">: Declared with </w:t>
-      </w:r>
-      <w:proofErr w:type="spellStart"/>
-      <w:r>
-        <w:t>func</w:t>
-      </w:r>
-      <w:proofErr w:type="spellEnd"/>
-      <w:r>
-        <w:t xml:space="preserve"> &lt;name</w:t>
-      </w:r>
-      <w:proofErr w:type="gramStart"/>
-      <w:r>
-        <w:t>&gt;([</w:t>
-      </w:r>
-      <w:proofErr w:type="gramEnd"/>
-      <w:r>
-        <w:t xml:space="preserve">params]): and must be terminated by a </w:t>
-      </w:r>
-      <w:proofErr w:type="gramStart"/>
-      <w:r>
-        <w:t>single ;</w:t>
-      </w:r>
-      <w:proofErr w:type="gramEnd"/>
-      <w:r>
-        <w:t xml:space="preserve"> on a new line. </w:t>
+        <w:t xml:space="preserve">: Declared with func &lt;name&gt;([params]): and must be terminated by a single ; on a new line. </w:t>
       </w:r>
     </w:p>
     <w:p>
@@ -1914,23 +1599,7 @@
         <w:t>Class Blocks</w:t>
       </w:r>
       <w:r>
-        <w:t>: Declared with class &lt;name</w:t>
-      </w:r>
-      <w:proofErr w:type="gramStart"/>
-      <w:r>
-        <w:t>&gt;::</w:t>
-      </w:r>
-      <w:proofErr w:type="gramEnd"/>
-      <w:r>
-        <w:t xml:space="preserve"> and must be terminated by a </w:t>
-      </w:r>
-      <w:proofErr w:type="gramStart"/>
-      <w:r>
-        <w:t>double ;</w:t>
-      </w:r>
-      <w:proofErr w:type="gramEnd"/>
-      <w:r>
-        <w:t xml:space="preserve">; on a new line. </w:t>
+        <w:t xml:space="preserve">: Declared with class &lt;name&gt;:: and must be terminated by a double ;; on a new line. </w:t>
       </w:r>
     </w:p>
     <w:p>
@@ -1949,23 +1618,7 @@
         <w:t>Strict Symmetry</w:t>
       </w:r>
       <w:r>
-        <w:t xml:space="preserve">: The start symbols (: </w:t>
-      </w:r>
-      <w:proofErr w:type="gramStart"/>
-      <w:r>
-        <w:t>and :</w:t>
-      </w:r>
-      <w:proofErr w:type="gramEnd"/>
-      <w:r>
-        <w:t xml:space="preserve">:) correspond directly to the weight of the closing symbols (; </w:t>
-      </w:r>
-      <w:proofErr w:type="gramStart"/>
-      <w:r>
-        <w:t>and ;</w:t>
-      </w:r>
-      <w:proofErr w:type="gramEnd"/>
-      <w:r>
-        <w:t>;).</w:t>
+        <w:t>: The start symbols (: and ::) correspond directly to the weight of the closing symbols (; and ;;).</w:t>
       </w:r>
     </w:p>
     <w:p>
@@ -2000,31 +1653,7 @@
         <w:t>Mandatory let</w:t>
       </w:r>
       <w:r>
-        <w:t xml:space="preserve">: The let keyword is required for all declarations, including function parameters (e.g., </w:t>
-      </w:r>
-      <w:proofErr w:type="spellStart"/>
-      <w:r>
-        <w:t>func</w:t>
-      </w:r>
-      <w:proofErr w:type="spellEnd"/>
-      <w:r>
-        <w:t xml:space="preserve"> </w:t>
-      </w:r>
-      <w:proofErr w:type="gramStart"/>
-      <w:r>
-        <w:t>add(</w:t>
-      </w:r>
-      <w:proofErr w:type="gramEnd"/>
-      <w:r>
-        <w:t xml:space="preserve">let int </w:t>
-      </w:r>
-      <w:proofErr w:type="gramStart"/>
-      <w:r>
-        <w:t>a):)</w:t>
-      </w:r>
-      <w:proofErr w:type="gramEnd"/>
-      <w:r>
-        <w:t xml:space="preserve">. </w:t>
+        <w:t xml:space="preserve">: The let keyword is required for all declarations, including function parameters (e.g., func add(let int a):). </w:t>
       </w:r>
     </w:p>
     <w:p>
@@ -2073,15 +1702,7 @@
         <w:t>block-terminating</w:t>
       </w:r>
       <w:r>
-        <w:t xml:space="preserve"> semicolons (; </w:t>
-      </w:r>
-      <w:proofErr w:type="gramStart"/>
-      <w:r>
-        <w:t>or ;</w:t>
-      </w:r>
-      <w:proofErr w:type="gramEnd"/>
-      <w:r>
-        <w:t xml:space="preserve">;) must occupy their own line to prevent lexical ambiguity. </w:t>
+        <w:t xml:space="preserve"> semicolons (; or ;;) must occupy their own line to prevent lexical ambiguity. </w:t>
       </w:r>
     </w:p>
     <w:p>
@@ -2135,15 +1756,7 @@
         <w:t>Empty Blocks</w:t>
       </w:r>
       <w:r>
-        <w:t xml:space="preserve">: Functions with no logic are permitted and will </w:t>
-      </w:r>
-      <w:proofErr w:type="gramStart"/>
-      <w:r>
-        <w:t>return</w:t>
-      </w:r>
-      <w:proofErr w:type="gramEnd"/>
-      <w:r>
-        <w:t xml:space="preserve"> a null/void state by default.</w:t>
+        <w:t>: Functions with no logic are permitted and will return a null/void state by default.</w:t>
       </w:r>
     </w:p>
     <w:p>
@@ -2162,15 +1775,7 @@
         <w:t>Input Handling</w:t>
       </w:r>
       <w:r>
-        <w:t>: The input(</w:t>
-      </w:r>
-      <w:proofErr w:type="gramStart"/>
-      <w:r>
-        <w:t>).&lt;</w:t>
-      </w:r>
-      <w:proofErr w:type="gramEnd"/>
-      <w:r>
-        <w:t>type&gt; syntax remains the primary way to capture and cast CLI data simultaneously.</w:t>
+        <w:t>: The input().&lt;type&gt; syntax remains the primary way to capture and cast CLI data simultaneously.</w:t>
       </w:r>
     </w:p>
     <w:p>

</xml_diff>

<commit_message>
Enhance compiler functionality: implement semantic analysis, code generation, and add error handling; update documentation with compiler theory and type rules.
</commit_message>
<xml_diff>
--- a/Documentation/MPPL Spec Doc.docx
+++ b/Documentation/MPPL Spec Doc.docx
@@ -5745,6 +5745,744 @@
       <w:pPr>
         <w:pStyle w:val="Compact"/>
       </w:pPr>
+      <w:r>
+        <w:t xml:space="preserve">In compiler theory, "walking the tree" is the process of moving through your </w:t>
+      </w:r>
+      <w:r>
+        <w:rPr>
+          <w:b/>
+          <w:bCs/>
+        </w:rPr>
+        <w:t>Abstract Syntax Tree (AST)</w:t>
+      </w:r>
+      <w:r>
+        <w:t xml:space="preserve"> to visit every node in a specific order. Since your AST is a hierarchy, we can't just read it left-to-right like a list; we </w:t>
+      </w:r>
+      <w:proofErr w:type="gramStart"/>
+      <w:r>
+        <w:t>have to</w:t>
+      </w:r>
+      <w:proofErr w:type="gramEnd"/>
+      <w:r>
+        <w:t xml:space="preserve"> travel up and down the branches to understand the relationships between the parts.</w:t>
+      </w:r>
+    </w:p>
+    <w:p>
+      <w:pPr>
+        <w:pStyle w:val="Compact"/>
+      </w:pPr>
+      <w:r>
+        <w:t xml:space="preserve">We use a technique called </w:t>
+      </w:r>
+      <w:proofErr w:type="gramStart"/>
+      <w:r>
+        <w:t xml:space="preserve">the </w:t>
+      </w:r>
+      <w:r>
+        <w:rPr>
+          <w:b/>
+          <w:bCs/>
+        </w:rPr>
+        <w:t>Visitor</w:t>
+      </w:r>
+      <w:proofErr w:type="gramEnd"/>
+      <w:r>
+        <w:rPr>
+          <w:b/>
+          <w:bCs/>
+        </w:rPr>
+        <w:t xml:space="preserve"> Pattern</w:t>
+      </w:r>
+      <w:r>
+        <w:t>.</w:t>
+      </w:r>
+    </w:p>
+    <w:p>
+      <w:pPr>
+        <w:pStyle w:val="Compact"/>
+      </w:pPr>
+      <w:r>
+        <w:pict w14:anchorId="546913A1">
+          <v:rect id="_x0000_i1095" style="width:0;height:1.5pt" o:hralign="center" o:hrstd="t" o:hr="t" fillcolor="#a0a0a0" stroked="f"/>
+        </w:pict>
+      </w:r>
+    </w:p>
+    <w:p>
+      <w:pPr>
+        <w:pStyle w:val="Compact"/>
+        <w:rPr>
+          <w:b/>
+          <w:bCs/>
+        </w:rPr>
+      </w:pPr>
+      <w:r>
+        <w:rPr>
+          <w:rFonts w:ascii="Segoe UI Emoji" w:hAnsi="Segoe UI Emoji" w:cs="Segoe UI Emoji"/>
+          <w:b/>
+          <w:bCs/>
+        </w:rPr>
+        <w:lastRenderedPageBreak/>
+        <w:t>📒</w:t>
+      </w:r>
+      <w:r>
+        <w:rPr>
+          <w:b/>
+          <w:bCs/>
+        </w:rPr>
+        <w:t xml:space="preserve"> Compiler Theory: The Visitor Pattern</w:t>
+      </w:r>
+    </w:p>
+    <w:p>
+      <w:pPr>
+        <w:pStyle w:val="Compact"/>
+        <w:rPr>
+          <w:b/>
+          <w:bCs/>
+        </w:rPr>
+      </w:pPr>
+      <w:r>
+        <w:rPr>
+          <w:b/>
+          <w:bCs/>
+        </w:rPr>
+        <w:t>1. The "Tourist" and the "Landmark"</w:t>
+      </w:r>
+    </w:p>
+    <w:p>
+      <w:pPr>
+        <w:pStyle w:val="Compact"/>
+      </w:pPr>
+      <w:r>
+        <w:t xml:space="preserve">Imagine your AST is a map of a city, and the </w:t>
+      </w:r>
+      <w:r>
+        <w:rPr>
+          <w:b/>
+          <w:bCs/>
+        </w:rPr>
+        <w:t>Semantic Analyzer</w:t>
+      </w:r>
+      <w:r>
+        <w:t xml:space="preserve"> is a tourist.</w:t>
+      </w:r>
+    </w:p>
+    <w:p>
+      <w:pPr>
+        <w:pStyle w:val="Compact"/>
+        <w:numPr>
+          <w:ilvl w:val="0"/>
+          <w:numId w:val="30"/>
+        </w:numPr>
+      </w:pPr>
+      <w:r>
+        <w:rPr>
+          <w:b/>
+          <w:bCs/>
+        </w:rPr>
+        <w:t>The AST (The City)</w:t>
+      </w:r>
+      <w:r>
+        <w:t xml:space="preserve">: It stays still. It contains "Landmarks" (Nodes like </w:t>
+      </w:r>
+      <w:proofErr w:type="spellStart"/>
+      <w:r>
+        <w:t>VarDecl</w:t>
+      </w:r>
+      <w:proofErr w:type="spellEnd"/>
+      <w:r>
+        <w:t xml:space="preserve">, Print, </w:t>
+      </w:r>
+      <w:proofErr w:type="spellStart"/>
+      <w:r>
+        <w:t>BinaryOp</w:t>
+      </w:r>
+      <w:proofErr w:type="spellEnd"/>
+      <w:r>
+        <w:t>).</w:t>
+      </w:r>
+    </w:p>
+    <w:p>
+      <w:pPr>
+        <w:pStyle w:val="Compact"/>
+        <w:numPr>
+          <w:ilvl w:val="0"/>
+          <w:numId w:val="30"/>
+        </w:numPr>
+      </w:pPr>
+      <w:r>
+        <w:rPr>
+          <w:b/>
+          <w:bCs/>
+        </w:rPr>
+        <w:t>The Visitor (The Tourist)</w:t>
+      </w:r>
+      <w:r>
+        <w:t>: It is a script that travels from landmark to landmark. At each stop, it performs a specific action, like checking a variable's type or looking up a name in the Symbol Table.</w:t>
+      </w:r>
+    </w:p>
+    <w:p>
+      <w:pPr>
+        <w:pStyle w:val="Compact"/>
+        <w:rPr>
+          <w:b/>
+          <w:bCs/>
+        </w:rPr>
+      </w:pPr>
+      <w:r>
+        <w:rPr>
+          <w:b/>
+          <w:bCs/>
+        </w:rPr>
+        <w:t>2. Recursive Traversal (Depth-First Search)</w:t>
+      </w:r>
+    </w:p>
+    <w:p>
+      <w:pPr>
+        <w:pStyle w:val="Compact"/>
+      </w:pPr>
+      <w:r>
+        <w:t xml:space="preserve">The most common way to walk the tree is </w:t>
+      </w:r>
+      <w:r>
+        <w:rPr>
+          <w:b/>
+          <w:bCs/>
+        </w:rPr>
+        <w:t>Depth-First</w:t>
+      </w:r>
+      <w:r>
+        <w:t>. This means the analyzer tries to reach the "leaves" (the literals and variables) before it finishes processing the "root" (the full statement).</w:t>
+      </w:r>
+    </w:p>
+    <w:p>
+      <w:pPr>
+        <w:pStyle w:val="Compact"/>
+      </w:pPr>
+      <w:r>
+        <w:rPr>
+          <w:b/>
+          <w:bCs/>
+        </w:rPr>
+        <w:t xml:space="preserve">Example: </w:t>
+      </w:r>
+      <w:proofErr w:type="gramStart"/>
+      <w:r>
+        <w:rPr>
+          <w:b/>
+          <w:bCs/>
+        </w:rPr>
+        <w:t>print(</w:t>
+      </w:r>
+      <w:proofErr w:type="gramEnd"/>
+      <w:r>
+        <w:rPr>
+          <w:b/>
+          <w:bCs/>
+        </w:rPr>
+        <w:t>x + 5</w:t>
+      </w:r>
+      <w:proofErr w:type="gramStart"/>
+      <w:r>
+        <w:rPr>
+          <w:b/>
+          <w:bCs/>
+        </w:rPr>
+        <w:t>);</w:t>
+      </w:r>
+      <w:proofErr w:type="gramEnd"/>
+    </w:p>
+    <w:p>
+      <w:pPr>
+        <w:pStyle w:val="Compact"/>
+        <w:numPr>
+          <w:ilvl w:val="0"/>
+          <w:numId w:val="31"/>
+        </w:numPr>
+      </w:pPr>
+      <w:r>
+        <w:t xml:space="preserve">The Visitor arrives at </w:t>
+      </w:r>
+      <w:proofErr w:type="gramStart"/>
+      <w:r>
+        <w:t xml:space="preserve">the </w:t>
+      </w:r>
+      <w:proofErr w:type="spellStart"/>
+      <w:r>
+        <w:rPr>
+          <w:b/>
+          <w:bCs/>
+        </w:rPr>
+        <w:t>PrintNode</w:t>
+      </w:r>
+      <w:proofErr w:type="spellEnd"/>
+      <w:proofErr w:type="gramEnd"/>
+      <w:r>
+        <w:t>.</w:t>
+      </w:r>
+    </w:p>
+    <w:p>
+      <w:pPr>
+        <w:pStyle w:val="Compact"/>
+        <w:numPr>
+          <w:ilvl w:val="0"/>
+          <w:numId w:val="31"/>
+        </w:numPr>
+      </w:pPr>
+      <w:r>
+        <w:t>It says: "I can't print this yet; I need to know what's inside."</w:t>
+      </w:r>
+    </w:p>
+    <w:p>
+      <w:pPr>
+        <w:pStyle w:val="Compact"/>
+        <w:numPr>
+          <w:ilvl w:val="0"/>
+          <w:numId w:val="31"/>
+        </w:numPr>
+      </w:pPr>
+      <w:r>
+        <w:t xml:space="preserve">It moves down to the </w:t>
+      </w:r>
+      <w:proofErr w:type="spellStart"/>
+      <w:r>
+        <w:rPr>
+          <w:b/>
+          <w:bCs/>
+        </w:rPr>
+        <w:t>BinaryOpNode</w:t>
+      </w:r>
+      <w:proofErr w:type="spellEnd"/>
+      <w:r>
+        <w:t xml:space="preserve"> (+).</w:t>
+      </w:r>
+    </w:p>
+    <w:p>
+      <w:pPr>
+        <w:pStyle w:val="Compact"/>
+        <w:numPr>
+          <w:ilvl w:val="0"/>
+          <w:numId w:val="31"/>
+        </w:numPr>
+      </w:pPr>
+      <w:r>
+        <w:t>It says: "I can't add these yet; I need to check the left and right sides."</w:t>
+      </w:r>
+    </w:p>
+    <w:p>
+      <w:pPr>
+        <w:pStyle w:val="Compact"/>
+        <w:numPr>
+          <w:ilvl w:val="0"/>
+          <w:numId w:val="31"/>
+        </w:numPr>
+      </w:pPr>
+      <w:r>
+        <w:t xml:space="preserve">It moves to the </w:t>
+      </w:r>
+      <w:proofErr w:type="spellStart"/>
+      <w:r>
+        <w:rPr>
+          <w:b/>
+          <w:bCs/>
+        </w:rPr>
+        <w:t>VarAccessNode</w:t>
+      </w:r>
+      <w:proofErr w:type="spellEnd"/>
+      <w:r>
+        <w:t xml:space="preserve"> (x). This is a leaf! It checks the </w:t>
+      </w:r>
+      <w:r>
+        <w:rPr>
+          <w:b/>
+          <w:bCs/>
+        </w:rPr>
+        <w:t>Symbol Table</w:t>
+      </w:r>
+      <w:r>
+        <w:t xml:space="preserve"> to see if x exists.</w:t>
+      </w:r>
+    </w:p>
+    <w:p>
+      <w:pPr>
+        <w:pStyle w:val="Compact"/>
+        <w:numPr>
+          <w:ilvl w:val="0"/>
+          <w:numId w:val="31"/>
+        </w:numPr>
+      </w:pPr>
+      <w:r>
+        <w:t xml:space="preserve">It moves to </w:t>
+      </w:r>
+      <w:proofErr w:type="gramStart"/>
+      <w:r>
+        <w:t xml:space="preserve">the </w:t>
+      </w:r>
+      <w:proofErr w:type="spellStart"/>
+      <w:r>
+        <w:rPr>
+          <w:b/>
+          <w:bCs/>
+        </w:rPr>
+        <w:t>LiteralNode</w:t>
+      </w:r>
+      <w:proofErr w:type="spellEnd"/>
+      <w:proofErr w:type="gramEnd"/>
+      <w:r>
+        <w:t xml:space="preserve"> (5). This is a leaf! It confirms it's an int.</w:t>
+      </w:r>
+    </w:p>
+    <w:p>
+      <w:pPr>
+        <w:pStyle w:val="Compact"/>
+        <w:numPr>
+          <w:ilvl w:val="0"/>
+          <w:numId w:val="31"/>
+        </w:numPr>
+      </w:pPr>
+      <w:r>
+        <w:t xml:space="preserve">Now, it moves back </w:t>
+      </w:r>
+      <w:r>
+        <w:rPr>
+          <w:b/>
+          <w:bCs/>
+        </w:rPr>
+        <w:t>up</w:t>
+      </w:r>
+      <w:r>
+        <w:t xml:space="preserve"> to the + node and asks: "Can I add an int to an int?".</w:t>
+      </w:r>
+    </w:p>
+    <w:p>
+      <w:pPr>
+        <w:pStyle w:val="Compact"/>
+        <w:numPr>
+          <w:ilvl w:val="0"/>
+          <w:numId w:val="31"/>
+        </w:numPr>
+      </w:pPr>
+      <w:r>
+        <w:t xml:space="preserve">Finally, it moves back to the </w:t>
+      </w:r>
+      <w:proofErr w:type="spellStart"/>
+      <w:r>
+        <w:rPr>
+          <w:b/>
+          <w:bCs/>
+        </w:rPr>
+        <w:t>PrintNode</w:t>
+      </w:r>
+      <w:proofErr w:type="spellEnd"/>
+      <w:r>
+        <w:t xml:space="preserve"> and says: "The logic inside is valid. I'm done."</w:t>
+      </w:r>
+    </w:p>
+    <w:p>
+      <w:pPr>
+        <w:pStyle w:val="Compact"/>
+      </w:pPr>
+    </w:p>
+    <w:p>
+      <w:pPr>
+        <w:pStyle w:val="Compact"/>
+      </w:pPr>
+    </w:p>
+    <w:p>
+      <w:pPr>
+        <w:pStyle w:val="Compact"/>
+        <w:rPr>
+          <w:b/>
+          <w:bCs/>
+        </w:rPr>
+      </w:pPr>
+      <w:r>
+        <w:rPr>
+          <w:rFonts w:ascii="Segoe UI Emoji" w:hAnsi="Segoe UI Emoji" w:cs="Segoe UI Emoji"/>
+          <w:b/>
+          <w:bCs/>
+        </w:rPr>
+        <w:t>📒</w:t>
+      </w:r>
+      <w:r>
+        <w:rPr>
+          <w:b/>
+          <w:bCs/>
+        </w:rPr>
+        <w:t xml:space="preserve"> </w:t>
+      </w:r>
+      <w:proofErr w:type="spellStart"/>
+      <w:r>
+        <w:rPr>
+          <w:b/>
+          <w:bCs/>
+        </w:rPr>
+        <w:t>Mapple</w:t>
+      </w:r>
+      <w:proofErr w:type="spellEnd"/>
+      <w:r>
+        <w:rPr>
+          <w:b/>
+          <w:bCs/>
+        </w:rPr>
+        <w:t xml:space="preserve"> Type Rules (v0.1)</w:t>
+      </w:r>
+    </w:p>
+    <w:p>
+      <w:pPr>
+        <w:pStyle w:val="Compact"/>
+      </w:pPr>
+      <w:r>
+        <w:t>Based on your specification and identity, we need to define how the +, -, *, and / operators behave when they meet different types.</w:t>
+      </w:r>
+    </w:p>
+    <w:p>
+      <w:pPr>
+        <w:pStyle w:val="Compact"/>
+        <w:rPr>
+          <w:b/>
+          <w:bCs/>
+        </w:rPr>
+      </w:pPr>
+      <w:r>
+        <w:rPr>
+          <w:b/>
+          <w:bCs/>
+        </w:rPr>
+        <w:t>1. The "Strict" Addition Rule (+)</w:t>
+      </w:r>
+    </w:p>
+    <w:p>
+      <w:pPr>
+        <w:pStyle w:val="Compact"/>
+        <w:numPr>
+          <w:ilvl w:val="0"/>
+          <w:numId w:val="32"/>
+        </w:numPr>
+      </w:pPr>
+      <w:r>
+        <w:rPr>
+          <w:b/>
+          <w:bCs/>
+        </w:rPr>
+        <w:t>Str + Str</w:t>
+      </w:r>
+      <w:r>
+        <w:t>: Valid. Results in a concatenated str.</w:t>
+      </w:r>
+    </w:p>
+    <w:p>
+      <w:pPr>
+        <w:pStyle w:val="Compact"/>
+        <w:numPr>
+          <w:ilvl w:val="0"/>
+          <w:numId w:val="32"/>
+        </w:numPr>
+      </w:pPr>
+      <w:r>
+        <w:rPr>
+          <w:b/>
+          <w:bCs/>
+        </w:rPr>
+        <w:t>Int + Int</w:t>
+      </w:r>
+      <w:r>
+        <w:t>: Valid. Results in an int.</w:t>
+      </w:r>
+    </w:p>
+    <w:p>
+      <w:pPr>
+        <w:pStyle w:val="Compact"/>
+        <w:numPr>
+          <w:ilvl w:val="0"/>
+          <w:numId w:val="32"/>
+        </w:numPr>
+      </w:pPr>
+      <w:r>
+        <w:rPr>
+          <w:b/>
+          <w:bCs/>
+        </w:rPr>
+        <w:t>Num + Num</w:t>
+      </w:r>
+      <w:r>
+        <w:t>: Valid. Results in a num.</w:t>
+      </w:r>
+    </w:p>
+    <w:p>
+      <w:pPr>
+        <w:pStyle w:val="Compact"/>
+        <w:numPr>
+          <w:ilvl w:val="0"/>
+          <w:numId w:val="32"/>
+        </w:numPr>
+      </w:pPr>
+      <w:r>
+        <w:rPr>
+          <w:b/>
+          <w:bCs/>
+        </w:rPr>
+        <w:t>Str + (Anything else)</w:t>
+      </w:r>
+      <w:r>
+        <w:t xml:space="preserve">: </w:t>
+      </w:r>
+      <w:r>
+        <w:rPr>
+          <w:b/>
+          <w:bCs/>
+        </w:rPr>
+        <w:t>Invalid.</w:t>
+      </w:r>
+      <w:r>
+        <w:t xml:space="preserve"> This is the core "Proper Habits" rule. The user must use .str to convert the other type first.</w:t>
+      </w:r>
+    </w:p>
+    <w:p>
+      <w:pPr>
+        <w:pStyle w:val="Compact"/>
+        <w:rPr>
+          <w:b/>
+          <w:bCs/>
+        </w:rPr>
+      </w:pPr>
+      <w:r>
+        <w:rPr>
+          <w:b/>
+          <w:bCs/>
+        </w:rPr>
+        <w:t>2. The "Numeric Promotion" Question</w:t>
+      </w:r>
+    </w:p>
+    <w:p>
+      <w:pPr>
+        <w:pStyle w:val="Compact"/>
+      </w:pPr>
+      <w:r>
+        <w:t>In many languages, int + num automatically converts the int to a num (this is called "Promotion").</w:t>
+      </w:r>
+    </w:p>
+    <w:p>
+      <w:pPr>
+        <w:pStyle w:val="Compact"/>
+        <w:numPr>
+          <w:ilvl w:val="0"/>
+          <w:numId w:val="33"/>
+        </w:numPr>
+      </w:pPr>
+      <w:r>
+        <w:rPr>
+          <w:b/>
+          <w:bCs/>
+        </w:rPr>
+        <w:t>Your Spec says</w:t>
+      </w:r>
+      <w:r>
+        <w:t>: "Implicit type conversion is not possible in version 0.1".</w:t>
+      </w:r>
+    </w:p>
+    <w:p>
+      <w:pPr>
+        <w:pStyle w:val="Compact"/>
+        <w:numPr>
+          <w:ilvl w:val="0"/>
+          <w:numId w:val="33"/>
+        </w:numPr>
+      </w:pPr>
+      <w:r>
+        <w:rPr>
+          <w:b/>
+          <w:bCs/>
+        </w:rPr>
+        <w:t>The Rule</w:t>
+      </w:r>
+      <w:r>
+        <w:t xml:space="preserve">: int + num will throw a </w:t>
+      </w:r>
+      <w:r>
+        <w:rPr>
+          <w:b/>
+          <w:bCs/>
+        </w:rPr>
+        <w:t>Semantic Error</w:t>
+      </w:r>
+      <w:r>
+        <w:t xml:space="preserve"> unless the user explicitly casts it, such as </w:t>
+      </w:r>
+      <w:proofErr w:type="spellStart"/>
+      <w:r>
+        <w:t>a.num</w:t>
+      </w:r>
+      <w:proofErr w:type="spellEnd"/>
+      <w:r>
+        <w:t xml:space="preserve"> + b.</w:t>
+      </w:r>
+    </w:p>
+    <w:p>
+      <w:pPr>
+        <w:pStyle w:val="Compact"/>
+        <w:rPr>
+          <w:b/>
+          <w:bCs/>
+        </w:rPr>
+      </w:pPr>
+      <w:r>
+        <w:rPr>
+          <w:b/>
+          <w:bCs/>
+        </w:rPr>
+        <w:t>3. Arithmetic Rules (-, *, /, %)</w:t>
+      </w:r>
+    </w:p>
+    <w:p>
+      <w:pPr>
+        <w:pStyle w:val="Compact"/>
+        <w:numPr>
+          <w:ilvl w:val="0"/>
+          <w:numId w:val="34"/>
+        </w:numPr>
+      </w:pPr>
+      <w:r>
+        <w:rPr>
+          <w:b/>
+          <w:bCs/>
+        </w:rPr>
+        <w:t>Numeric only</w:t>
+      </w:r>
+      <w:r>
+        <w:t>: These operators only work on int and num.</w:t>
+      </w:r>
+    </w:p>
+    <w:p>
+      <w:pPr>
+        <w:pStyle w:val="Compact"/>
+        <w:numPr>
+          <w:ilvl w:val="0"/>
+          <w:numId w:val="34"/>
+        </w:numPr>
+      </w:pPr>
+      <w:r>
+        <w:rPr>
+          <w:b/>
+          <w:bCs/>
+        </w:rPr>
+        <w:t>Type Match</w:t>
+      </w:r>
+      <w:r>
+        <w:t xml:space="preserve">: Both sides must be the same type. You cannot subtract a </w:t>
+      </w:r>
+      <w:proofErr w:type="gramStart"/>
+      <w:r>
+        <w:t>char</w:t>
+      </w:r>
+      <w:proofErr w:type="gramEnd"/>
+      <w:r>
+        <w:t xml:space="preserve"> from a str.</w:t>
+      </w:r>
+    </w:p>
+    <w:p>
+      <w:pPr>
+        <w:pStyle w:val="Compact"/>
+      </w:pPr>
     </w:p>
     <w:sectPr>
       <w:footnotePr>
@@ -5943,6 +6681,304 @@
     </w:lvl>
   </w:abstractNum>
   <w:abstractNum w:abstractNumId="2" w15:restartNumberingAfterBreak="0">
+    <w:nsid w:val="0B0500FA"/>
+    <w:multiLevelType w:val="multilevel"/>
+    <w:tmpl w:val="2CCA93CE"/>
+    <w:lvl w:ilvl="0">
+      <w:start w:val="1"/>
+      <w:numFmt w:val="bullet"/>
+      <w:lvlText w:val=""/>
+      <w:lvlJc w:val="left"/>
+      <w:pPr>
+        <w:tabs>
+          <w:tab w:val="num" w:pos="720"/>
+        </w:tabs>
+        <w:ind w:left="720" w:hanging="360"/>
+      </w:pPr>
+      <w:rPr>
+        <w:rFonts w:ascii="Symbol" w:hAnsi="Symbol" w:hint="default"/>
+        <w:sz w:val="20"/>
+      </w:rPr>
+    </w:lvl>
+    <w:lvl w:ilvl="1" w:tentative="1">
+      <w:start w:val="1"/>
+      <w:numFmt w:val="bullet"/>
+      <w:lvlText w:val="o"/>
+      <w:lvlJc w:val="left"/>
+      <w:pPr>
+        <w:tabs>
+          <w:tab w:val="num" w:pos="1440"/>
+        </w:tabs>
+        <w:ind w:left="1440" w:hanging="360"/>
+      </w:pPr>
+      <w:rPr>
+        <w:rFonts w:ascii="Courier New" w:hAnsi="Courier New" w:hint="default"/>
+        <w:sz w:val="20"/>
+      </w:rPr>
+    </w:lvl>
+    <w:lvl w:ilvl="2" w:tentative="1">
+      <w:start w:val="1"/>
+      <w:numFmt w:val="bullet"/>
+      <w:lvlText w:val=""/>
+      <w:lvlJc w:val="left"/>
+      <w:pPr>
+        <w:tabs>
+          <w:tab w:val="num" w:pos="2160"/>
+        </w:tabs>
+        <w:ind w:left="2160" w:hanging="360"/>
+      </w:pPr>
+      <w:rPr>
+        <w:rFonts w:ascii="Wingdings" w:hAnsi="Wingdings" w:hint="default"/>
+        <w:sz w:val="20"/>
+      </w:rPr>
+    </w:lvl>
+    <w:lvl w:ilvl="3" w:tentative="1">
+      <w:start w:val="1"/>
+      <w:numFmt w:val="bullet"/>
+      <w:lvlText w:val=""/>
+      <w:lvlJc w:val="left"/>
+      <w:pPr>
+        <w:tabs>
+          <w:tab w:val="num" w:pos="2880"/>
+        </w:tabs>
+        <w:ind w:left="2880" w:hanging="360"/>
+      </w:pPr>
+      <w:rPr>
+        <w:rFonts w:ascii="Wingdings" w:hAnsi="Wingdings" w:hint="default"/>
+        <w:sz w:val="20"/>
+      </w:rPr>
+    </w:lvl>
+    <w:lvl w:ilvl="4" w:tentative="1">
+      <w:start w:val="1"/>
+      <w:numFmt w:val="bullet"/>
+      <w:lvlText w:val=""/>
+      <w:lvlJc w:val="left"/>
+      <w:pPr>
+        <w:tabs>
+          <w:tab w:val="num" w:pos="3600"/>
+        </w:tabs>
+        <w:ind w:left="3600" w:hanging="360"/>
+      </w:pPr>
+      <w:rPr>
+        <w:rFonts w:ascii="Wingdings" w:hAnsi="Wingdings" w:hint="default"/>
+        <w:sz w:val="20"/>
+      </w:rPr>
+    </w:lvl>
+    <w:lvl w:ilvl="5" w:tentative="1">
+      <w:start w:val="1"/>
+      <w:numFmt w:val="bullet"/>
+      <w:lvlText w:val=""/>
+      <w:lvlJc w:val="left"/>
+      <w:pPr>
+        <w:tabs>
+          <w:tab w:val="num" w:pos="4320"/>
+        </w:tabs>
+        <w:ind w:left="4320" w:hanging="360"/>
+      </w:pPr>
+      <w:rPr>
+        <w:rFonts w:ascii="Wingdings" w:hAnsi="Wingdings" w:hint="default"/>
+        <w:sz w:val="20"/>
+      </w:rPr>
+    </w:lvl>
+    <w:lvl w:ilvl="6" w:tentative="1">
+      <w:start w:val="1"/>
+      <w:numFmt w:val="bullet"/>
+      <w:lvlText w:val=""/>
+      <w:lvlJc w:val="left"/>
+      <w:pPr>
+        <w:tabs>
+          <w:tab w:val="num" w:pos="5040"/>
+        </w:tabs>
+        <w:ind w:left="5040" w:hanging="360"/>
+      </w:pPr>
+      <w:rPr>
+        <w:rFonts w:ascii="Wingdings" w:hAnsi="Wingdings" w:hint="default"/>
+        <w:sz w:val="20"/>
+      </w:rPr>
+    </w:lvl>
+    <w:lvl w:ilvl="7" w:tentative="1">
+      <w:start w:val="1"/>
+      <w:numFmt w:val="bullet"/>
+      <w:lvlText w:val=""/>
+      <w:lvlJc w:val="left"/>
+      <w:pPr>
+        <w:tabs>
+          <w:tab w:val="num" w:pos="5760"/>
+        </w:tabs>
+        <w:ind w:left="5760" w:hanging="360"/>
+      </w:pPr>
+      <w:rPr>
+        <w:rFonts w:ascii="Wingdings" w:hAnsi="Wingdings" w:hint="default"/>
+        <w:sz w:val="20"/>
+      </w:rPr>
+    </w:lvl>
+    <w:lvl w:ilvl="8" w:tentative="1">
+      <w:start w:val="1"/>
+      <w:numFmt w:val="bullet"/>
+      <w:lvlText w:val=""/>
+      <w:lvlJc w:val="left"/>
+      <w:pPr>
+        <w:tabs>
+          <w:tab w:val="num" w:pos="6480"/>
+        </w:tabs>
+        <w:ind w:left="6480" w:hanging="360"/>
+      </w:pPr>
+      <w:rPr>
+        <w:rFonts w:ascii="Wingdings" w:hAnsi="Wingdings" w:hint="default"/>
+        <w:sz w:val="20"/>
+      </w:rPr>
+    </w:lvl>
+  </w:abstractNum>
+  <w:abstractNum w:abstractNumId="3" w15:restartNumberingAfterBreak="0">
+    <w:nsid w:val="166B4C04"/>
+    <w:multiLevelType w:val="multilevel"/>
+    <w:tmpl w:val="F2C61BA6"/>
+    <w:lvl w:ilvl="0">
+      <w:start w:val="1"/>
+      <w:numFmt w:val="bullet"/>
+      <w:lvlText w:val=""/>
+      <w:lvlJc w:val="left"/>
+      <w:pPr>
+        <w:tabs>
+          <w:tab w:val="num" w:pos="720"/>
+        </w:tabs>
+        <w:ind w:left="720" w:hanging="360"/>
+      </w:pPr>
+      <w:rPr>
+        <w:rFonts w:ascii="Symbol" w:hAnsi="Symbol" w:hint="default"/>
+        <w:sz w:val="20"/>
+      </w:rPr>
+    </w:lvl>
+    <w:lvl w:ilvl="1" w:tentative="1">
+      <w:start w:val="1"/>
+      <w:numFmt w:val="bullet"/>
+      <w:lvlText w:val="o"/>
+      <w:lvlJc w:val="left"/>
+      <w:pPr>
+        <w:tabs>
+          <w:tab w:val="num" w:pos="1440"/>
+        </w:tabs>
+        <w:ind w:left="1440" w:hanging="360"/>
+      </w:pPr>
+      <w:rPr>
+        <w:rFonts w:ascii="Courier New" w:hAnsi="Courier New" w:hint="default"/>
+        <w:sz w:val="20"/>
+      </w:rPr>
+    </w:lvl>
+    <w:lvl w:ilvl="2" w:tentative="1">
+      <w:start w:val="1"/>
+      <w:numFmt w:val="bullet"/>
+      <w:lvlText w:val=""/>
+      <w:lvlJc w:val="left"/>
+      <w:pPr>
+        <w:tabs>
+          <w:tab w:val="num" w:pos="2160"/>
+        </w:tabs>
+        <w:ind w:left="2160" w:hanging="360"/>
+      </w:pPr>
+      <w:rPr>
+        <w:rFonts w:ascii="Wingdings" w:hAnsi="Wingdings" w:hint="default"/>
+        <w:sz w:val="20"/>
+      </w:rPr>
+    </w:lvl>
+    <w:lvl w:ilvl="3" w:tentative="1">
+      <w:start w:val="1"/>
+      <w:numFmt w:val="bullet"/>
+      <w:lvlText w:val=""/>
+      <w:lvlJc w:val="left"/>
+      <w:pPr>
+        <w:tabs>
+          <w:tab w:val="num" w:pos="2880"/>
+        </w:tabs>
+        <w:ind w:left="2880" w:hanging="360"/>
+      </w:pPr>
+      <w:rPr>
+        <w:rFonts w:ascii="Wingdings" w:hAnsi="Wingdings" w:hint="default"/>
+        <w:sz w:val="20"/>
+      </w:rPr>
+    </w:lvl>
+    <w:lvl w:ilvl="4" w:tentative="1">
+      <w:start w:val="1"/>
+      <w:numFmt w:val="bullet"/>
+      <w:lvlText w:val=""/>
+      <w:lvlJc w:val="left"/>
+      <w:pPr>
+        <w:tabs>
+          <w:tab w:val="num" w:pos="3600"/>
+        </w:tabs>
+        <w:ind w:left="3600" w:hanging="360"/>
+      </w:pPr>
+      <w:rPr>
+        <w:rFonts w:ascii="Wingdings" w:hAnsi="Wingdings" w:hint="default"/>
+        <w:sz w:val="20"/>
+      </w:rPr>
+    </w:lvl>
+    <w:lvl w:ilvl="5" w:tentative="1">
+      <w:start w:val="1"/>
+      <w:numFmt w:val="bullet"/>
+      <w:lvlText w:val=""/>
+      <w:lvlJc w:val="left"/>
+      <w:pPr>
+        <w:tabs>
+          <w:tab w:val="num" w:pos="4320"/>
+        </w:tabs>
+        <w:ind w:left="4320" w:hanging="360"/>
+      </w:pPr>
+      <w:rPr>
+        <w:rFonts w:ascii="Wingdings" w:hAnsi="Wingdings" w:hint="default"/>
+        <w:sz w:val="20"/>
+      </w:rPr>
+    </w:lvl>
+    <w:lvl w:ilvl="6" w:tentative="1">
+      <w:start w:val="1"/>
+      <w:numFmt w:val="bullet"/>
+      <w:lvlText w:val=""/>
+      <w:lvlJc w:val="left"/>
+      <w:pPr>
+        <w:tabs>
+          <w:tab w:val="num" w:pos="5040"/>
+        </w:tabs>
+        <w:ind w:left="5040" w:hanging="360"/>
+      </w:pPr>
+      <w:rPr>
+        <w:rFonts w:ascii="Wingdings" w:hAnsi="Wingdings" w:hint="default"/>
+        <w:sz w:val="20"/>
+      </w:rPr>
+    </w:lvl>
+    <w:lvl w:ilvl="7" w:tentative="1">
+      <w:start w:val="1"/>
+      <w:numFmt w:val="bullet"/>
+      <w:lvlText w:val=""/>
+      <w:lvlJc w:val="left"/>
+      <w:pPr>
+        <w:tabs>
+          <w:tab w:val="num" w:pos="5760"/>
+        </w:tabs>
+        <w:ind w:left="5760" w:hanging="360"/>
+      </w:pPr>
+      <w:rPr>
+        <w:rFonts w:ascii="Wingdings" w:hAnsi="Wingdings" w:hint="default"/>
+        <w:sz w:val="20"/>
+      </w:rPr>
+    </w:lvl>
+    <w:lvl w:ilvl="8" w:tentative="1">
+      <w:start w:val="1"/>
+      <w:numFmt w:val="bullet"/>
+      <w:lvlText w:val=""/>
+      <w:lvlJc w:val="left"/>
+      <w:pPr>
+        <w:tabs>
+          <w:tab w:val="num" w:pos="6480"/>
+        </w:tabs>
+        <w:ind w:left="6480" w:hanging="360"/>
+      </w:pPr>
+      <w:rPr>
+        <w:rFonts w:ascii="Wingdings" w:hAnsi="Wingdings" w:hint="default"/>
+        <w:sz w:val="20"/>
+      </w:rPr>
+    </w:lvl>
+  </w:abstractNum>
+  <w:abstractNum w:abstractNumId="4" w15:restartNumberingAfterBreak="0">
     <w:nsid w:val="1F204003"/>
     <w:multiLevelType w:val="multilevel"/>
     <w:tmpl w:val="DDEEA7BC"/>
@@ -6091,7 +7127,7 @@
       </w:rPr>
     </w:lvl>
   </w:abstractNum>
-  <w:abstractNum w:abstractNumId="3" w15:restartNumberingAfterBreak="0">
+  <w:abstractNum w:abstractNumId="5" w15:restartNumberingAfterBreak="0">
     <w:nsid w:val="1F967D98"/>
     <w:multiLevelType w:val="multilevel"/>
     <w:tmpl w:val="F22E938E"/>
@@ -6240,7 +7276,7 @@
       </w:rPr>
     </w:lvl>
   </w:abstractNum>
-  <w:abstractNum w:abstractNumId="4" w15:restartNumberingAfterBreak="0">
+  <w:abstractNum w:abstractNumId="6" w15:restartNumberingAfterBreak="0">
     <w:nsid w:val="217F3C2D"/>
     <w:multiLevelType w:val="multilevel"/>
     <w:tmpl w:val="B0088F04"/>
@@ -6389,7 +7425,7 @@
       </w:rPr>
     </w:lvl>
   </w:abstractNum>
-  <w:abstractNum w:abstractNumId="5" w15:restartNumberingAfterBreak="0">
+  <w:abstractNum w:abstractNumId="7" w15:restartNumberingAfterBreak="0">
     <w:nsid w:val="36B02E06"/>
     <w:multiLevelType w:val="multilevel"/>
     <w:tmpl w:val="BFA013E4"/>
@@ -6538,7 +7574,7 @@
       </w:rPr>
     </w:lvl>
   </w:abstractNum>
-  <w:abstractNum w:abstractNumId="6" w15:restartNumberingAfterBreak="0">
+  <w:abstractNum w:abstractNumId="8" w15:restartNumberingAfterBreak="0">
     <w:nsid w:val="37E51BD9"/>
     <w:multiLevelType w:val="multilevel"/>
     <w:tmpl w:val="2F5E7620"/>
@@ -6687,7 +7723,156 @@
       </w:rPr>
     </w:lvl>
   </w:abstractNum>
-  <w:abstractNum w:abstractNumId="7" w15:restartNumberingAfterBreak="0">
+  <w:abstractNum w:abstractNumId="9" w15:restartNumberingAfterBreak="0">
+    <w:nsid w:val="390F45E2"/>
+    <w:multiLevelType w:val="multilevel"/>
+    <w:tmpl w:val="6916F5A2"/>
+    <w:lvl w:ilvl="0">
+      <w:start w:val="1"/>
+      <w:numFmt w:val="bullet"/>
+      <w:lvlText w:val=""/>
+      <w:lvlJc w:val="left"/>
+      <w:pPr>
+        <w:tabs>
+          <w:tab w:val="num" w:pos="720"/>
+        </w:tabs>
+        <w:ind w:left="720" w:hanging="360"/>
+      </w:pPr>
+      <w:rPr>
+        <w:rFonts w:ascii="Symbol" w:hAnsi="Symbol" w:hint="default"/>
+        <w:sz w:val="20"/>
+      </w:rPr>
+    </w:lvl>
+    <w:lvl w:ilvl="1" w:tentative="1">
+      <w:start w:val="1"/>
+      <w:numFmt w:val="bullet"/>
+      <w:lvlText w:val="o"/>
+      <w:lvlJc w:val="left"/>
+      <w:pPr>
+        <w:tabs>
+          <w:tab w:val="num" w:pos="1440"/>
+        </w:tabs>
+        <w:ind w:left="1440" w:hanging="360"/>
+      </w:pPr>
+      <w:rPr>
+        <w:rFonts w:ascii="Courier New" w:hAnsi="Courier New" w:hint="default"/>
+        <w:sz w:val="20"/>
+      </w:rPr>
+    </w:lvl>
+    <w:lvl w:ilvl="2" w:tentative="1">
+      <w:start w:val="1"/>
+      <w:numFmt w:val="bullet"/>
+      <w:lvlText w:val=""/>
+      <w:lvlJc w:val="left"/>
+      <w:pPr>
+        <w:tabs>
+          <w:tab w:val="num" w:pos="2160"/>
+        </w:tabs>
+        <w:ind w:left="2160" w:hanging="360"/>
+      </w:pPr>
+      <w:rPr>
+        <w:rFonts w:ascii="Wingdings" w:hAnsi="Wingdings" w:hint="default"/>
+        <w:sz w:val="20"/>
+      </w:rPr>
+    </w:lvl>
+    <w:lvl w:ilvl="3" w:tentative="1">
+      <w:start w:val="1"/>
+      <w:numFmt w:val="bullet"/>
+      <w:lvlText w:val=""/>
+      <w:lvlJc w:val="left"/>
+      <w:pPr>
+        <w:tabs>
+          <w:tab w:val="num" w:pos="2880"/>
+        </w:tabs>
+        <w:ind w:left="2880" w:hanging="360"/>
+      </w:pPr>
+      <w:rPr>
+        <w:rFonts w:ascii="Wingdings" w:hAnsi="Wingdings" w:hint="default"/>
+        <w:sz w:val="20"/>
+      </w:rPr>
+    </w:lvl>
+    <w:lvl w:ilvl="4" w:tentative="1">
+      <w:start w:val="1"/>
+      <w:numFmt w:val="bullet"/>
+      <w:lvlText w:val=""/>
+      <w:lvlJc w:val="left"/>
+      <w:pPr>
+        <w:tabs>
+          <w:tab w:val="num" w:pos="3600"/>
+        </w:tabs>
+        <w:ind w:left="3600" w:hanging="360"/>
+      </w:pPr>
+      <w:rPr>
+        <w:rFonts w:ascii="Wingdings" w:hAnsi="Wingdings" w:hint="default"/>
+        <w:sz w:val="20"/>
+      </w:rPr>
+    </w:lvl>
+    <w:lvl w:ilvl="5" w:tentative="1">
+      <w:start w:val="1"/>
+      <w:numFmt w:val="bullet"/>
+      <w:lvlText w:val=""/>
+      <w:lvlJc w:val="left"/>
+      <w:pPr>
+        <w:tabs>
+          <w:tab w:val="num" w:pos="4320"/>
+        </w:tabs>
+        <w:ind w:left="4320" w:hanging="360"/>
+      </w:pPr>
+      <w:rPr>
+        <w:rFonts w:ascii="Wingdings" w:hAnsi="Wingdings" w:hint="default"/>
+        <w:sz w:val="20"/>
+      </w:rPr>
+    </w:lvl>
+    <w:lvl w:ilvl="6" w:tentative="1">
+      <w:start w:val="1"/>
+      <w:numFmt w:val="bullet"/>
+      <w:lvlText w:val=""/>
+      <w:lvlJc w:val="left"/>
+      <w:pPr>
+        <w:tabs>
+          <w:tab w:val="num" w:pos="5040"/>
+        </w:tabs>
+        <w:ind w:left="5040" w:hanging="360"/>
+      </w:pPr>
+      <w:rPr>
+        <w:rFonts w:ascii="Wingdings" w:hAnsi="Wingdings" w:hint="default"/>
+        <w:sz w:val="20"/>
+      </w:rPr>
+    </w:lvl>
+    <w:lvl w:ilvl="7" w:tentative="1">
+      <w:start w:val="1"/>
+      <w:numFmt w:val="bullet"/>
+      <w:lvlText w:val=""/>
+      <w:lvlJc w:val="left"/>
+      <w:pPr>
+        <w:tabs>
+          <w:tab w:val="num" w:pos="5760"/>
+        </w:tabs>
+        <w:ind w:left="5760" w:hanging="360"/>
+      </w:pPr>
+      <w:rPr>
+        <w:rFonts w:ascii="Wingdings" w:hAnsi="Wingdings" w:hint="default"/>
+        <w:sz w:val="20"/>
+      </w:rPr>
+    </w:lvl>
+    <w:lvl w:ilvl="8" w:tentative="1">
+      <w:start w:val="1"/>
+      <w:numFmt w:val="bullet"/>
+      <w:lvlText w:val=""/>
+      <w:lvlJc w:val="left"/>
+      <w:pPr>
+        <w:tabs>
+          <w:tab w:val="num" w:pos="6480"/>
+        </w:tabs>
+        <w:ind w:left="6480" w:hanging="360"/>
+      </w:pPr>
+      <w:rPr>
+        <w:rFonts w:ascii="Wingdings" w:hAnsi="Wingdings" w:hint="default"/>
+        <w:sz w:val="20"/>
+      </w:rPr>
+    </w:lvl>
+  </w:abstractNum>
+  <w:abstractNum w:abstractNumId="10" w15:restartNumberingAfterBreak="0">
     <w:nsid w:val="3A063848"/>
     <w:multiLevelType w:val="multilevel"/>
     <w:tmpl w:val="C46296FE"/>
@@ -6836,7 +8021,7 @@
       </w:rPr>
     </w:lvl>
   </w:abstractNum>
-  <w:abstractNum w:abstractNumId="8" w15:restartNumberingAfterBreak="0">
+  <w:abstractNum w:abstractNumId="11" w15:restartNumberingAfterBreak="0">
     <w:nsid w:val="3EC12AD8"/>
     <w:multiLevelType w:val="multilevel"/>
     <w:tmpl w:val="B96ACAD2"/>
@@ -6985,7 +8170,7 @@
       </w:rPr>
     </w:lvl>
   </w:abstractNum>
-  <w:abstractNum w:abstractNumId="9" w15:restartNumberingAfterBreak="0">
+  <w:abstractNum w:abstractNumId="12" w15:restartNumberingAfterBreak="0">
     <w:nsid w:val="3EF61330"/>
     <w:multiLevelType w:val="multilevel"/>
     <w:tmpl w:val="B0704C3E"/>
@@ -7134,7 +8319,7 @@
       </w:rPr>
     </w:lvl>
   </w:abstractNum>
-  <w:abstractNum w:abstractNumId="10" w15:restartNumberingAfterBreak="0">
+  <w:abstractNum w:abstractNumId="13" w15:restartNumberingAfterBreak="0">
     <w:nsid w:val="43401EFB"/>
     <w:multiLevelType w:val="multilevel"/>
     <w:tmpl w:val="579C5676"/>
@@ -7283,7 +8468,7 @@
       </w:rPr>
     </w:lvl>
   </w:abstractNum>
-  <w:abstractNum w:abstractNumId="11" w15:restartNumberingAfterBreak="0">
+  <w:abstractNum w:abstractNumId="14" w15:restartNumberingAfterBreak="0">
     <w:nsid w:val="4AA8516C"/>
     <w:multiLevelType w:val="multilevel"/>
     <w:tmpl w:val="E2904E42"/>
@@ -7396,7 +8581,7 @@
       </w:pPr>
     </w:lvl>
   </w:abstractNum>
-  <w:abstractNum w:abstractNumId="12" w15:restartNumberingAfterBreak="0">
+  <w:abstractNum w:abstractNumId="15" w15:restartNumberingAfterBreak="0">
     <w:nsid w:val="585D3390"/>
     <w:multiLevelType w:val="multilevel"/>
     <w:tmpl w:val="C23CF0EC"/>
@@ -7509,7 +8694,156 @@
       </w:pPr>
     </w:lvl>
   </w:abstractNum>
-  <w:abstractNum w:abstractNumId="13" w15:restartNumberingAfterBreak="0">
+  <w:abstractNum w:abstractNumId="16" w15:restartNumberingAfterBreak="0">
+    <w:nsid w:val="5974070F"/>
+    <w:multiLevelType w:val="multilevel"/>
+    <w:tmpl w:val="09C08A28"/>
+    <w:lvl w:ilvl="0">
+      <w:start w:val="1"/>
+      <w:numFmt w:val="bullet"/>
+      <w:lvlText w:val=""/>
+      <w:lvlJc w:val="left"/>
+      <w:pPr>
+        <w:tabs>
+          <w:tab w:val="num" w:pos="720"/>
+        </w:tabs>
+        <w:ind w:left="720" w:hanging="360"/>
+      </w:pPr>
+      <w:rPr>
+        <w:rFonts w:ascii="Symbol" w:hAnsi="Symbol" w:hint="default"/>
+        <w:sz w:val="20"/>
+      </w:rPr>
+    </w:lvl>
+    <w:lvl w:ilvl="1" w:tentative="1">
+      <w:start w:val="1"/>
+      <w:numFmt w:val="bullet"/>
+      <w:lvlText w:val="o"/>
+      <w:lvlJc w:val="left"/>
+      <w:pPr>
+        <w:tabs>
+          <w:tab w:val="num" w:pos="1440"/>
+        </w:tabs>
+        <w:ind w:left="1440" w:hanging="360"/>
+      </w:pPr>
+      <w:rPr>
+        <w:rFonts w:ascii="Courier New" w:hAnsi="Courier New" w:hint="default"/>
+        <w:sz w:val="20"/>
+      </w:rPr>
+    </w:lvl>
+    <w:lvl w:ilvl="2" w:tentative="1">
+      <w:start w:val="1"/>
+      <w:numFmt w:val="bullet"/>
+      <w:lvlText w:val=""/>
+      <w:lvlJc w:val="left"/>
+      <w:pPr>
+        <w:tabs>
+          <w:tab w:val="num" w:pos="2160"/>
+        </w:tabs>
+        <w:ind w:left="2160" w:hanging="360"/>
+      </w:pPr>
+      <w:rPr>
+        <w:rFonts w:ascii="Wingdings" w:hAnsi="Wingdings" w:hint="default"/>
+        <w:sz w:val="20"/>
+      </w:rPr>
+    </w:lvl>
+    <w:lvl w:ilvl="3" w:tentative="1">
+      <w:start w:val="1"/>
+      <w:numFmt w:val="bullet"/>
+      <w:lvlText w:val=""/>
+      <w:lvlJc w:val="left"/>
+      <w:pPr>
+        <w:tabs>
+          <w:tab w:val="num" w:pos="2880"/>
+        </w:tabs>
+        <w:ind w:left="2880" w:hanging="360"/>
+      </w:pPr>
+      <w:rPr>
+        <w:rFonts w:ascii="Wingdings" w:hAnsi="Wingdings" w:hint="default"/>
+        <w:sz w:val="20"/>
+      </w:rPr>
+    </w:lvl>
+    <w:lvl w:ilvl="4" w:tentative="1">
+      <w:start w:val="1"/>
+      <w:numFmt w:val="bullet"/>
+      <w:lvlText w:val=""/>
+      <w:lvlJc w:val="left"/>
+      <w:pPr>
+        <w:tabs>
+          <w:tab w:val="num" w:pos="3600"/>
+        </w:tabs>
+        <w:ind w:left="3600" w:hanging="360"/>
+      </w:pPr>
+      <w:rPr>
+        <w:rFonts w:ascii="Wingdings" w:hAnsi="Wingdings" w:hint="default"/>
+        <w:sz w:val="20"/>
+      </w:rPr>
+    </w:lvl>
+    <w:lvl w:ilvl="5" w:tentative="1">
+      <w:start w:val="1"/>
+      <w:numFmt w:val="bullet"/>
+      <w:lvlText w:val=""/>
+      <w:lvlJc w:val="left"/>
+      <w:pPr>
+        <w:tabs>
+          <w:tab w:val="num" w:pos="4320"/>
+        </w:tabs>
+        <w:ind w:left="4320" w:hanging="360"/>
+      </w:pPr>
+      <w:rPr>
+        <w:rFonts w:ascii="Wingdings" w:hAnsi="Wingdings" w:hint="default"/>
+        <w:sz w:val="20"/>
+      </w:rPr>
+    </w:lvl>
+    <w:lvl w:ilvl="6" w:tentative="1">
+      <w:start w:val="1"/>
+      <w:numFmt w:val="bullet"/>
+      <w:lvlText w:val=""/>
+      <w:lvlJc w:val="left"/>
+      <w:pPr>
+        <w:tabs>
+          <w:tab w:val="num" w:pos="5040"/>
+        </w:tabs>
+        <w:ind w:left="5040" w:hanging="360"/>
+      </w:pPr>
+      <w:rPr>
+        <w:rFonts w:ascii="Wingdings" w:hAnsi="Wingdings" w:hint="default"/>
+        <w:sz w:val="20"/>
+      </w:rPr>
+    </w:lvl>
+    <w:lvl w:ilvl="7" w:tentative="1">
+      <w:start w:val="1"/>
+      <w:numFmt w:val="bullet"/>
+      <w:lvlText w:val=""/>
+      <w:lvlJc w:val="left"/>
+      <w:pPr>
+        <w:tabs>
+          <w:tab w:val="num" w:pos="5760"/>
+        </w:tabs>
+        <w:ind w:left="5760" w:hanging="360"/>
+      </w:pPr>
+      <w:rPr>
+        <w:rFonts w:ascii="Wingdings" w:hAnsi="Wingdings" w:hint="default"/>
+        <w:sz w:val="20"/>
+      </w:rPr>
+    </w:lvl>
+    <w:lvl w:ilvl="8" w:tentative="1">
+      <w:start w:val="1"/>
+      <w:numFmt w:val="bullet"/>
+      <w:lvlText w:val=""/>
+      <w:lvlJc w:val="left"/>
+      <w:pPr>
+        <w:tabs>
+          <w:tab w:val="num" w:pos="6480"/>
+        </w:tabs>
+        <w:ind w:left="6480" w:hanging="360"/>
+      </w:pPr>
+      <w:rPr>
+        <w:rFonts w:ascii="Wingdings" w:hAnsi="Wingdings" w:hint="default"/>
+        <w:sz w:val="20"/>
+      </w:rPr>
+    </w:lvl>
+  </w:abstractNum>
+  <w:abstractNum w:abstractNumId="17" w15:restartNumberingAfterBreak="0">
     <w:nsid w:val="5ECD26E2"/>
     <w:multiLevelType w:val="multilevel"/>
     <w:tmpl w:val="B35C5E7C"/>
@@ -7622,7 +8956,7 @@
       </w:pPr>
     </w:lvl>
   </w:abstractNum>
-  <w:abstractNum w:abstractNumId="14" w15:restartNumberingAfterBreak="0">
+  <w:abstractNum w:abstractNumId="18" w15:restartNumberingAfterBreak="0">
     <w:nsid w:val="629707BB"/>
     <w:multiLevelType w:val="multilevel"/>
     <w:tmpl w:val="A2EA769C"/>
@@ -7771,7 +9105,120 @@
       </w:rPr>
     </w:lvl>
   </w:abstractNum>
-  <w:abstractNum w:abstractNumId="15" w15:restartNumberingAfterBreak="0">
+  <w:abstractNum w:abstractNumId="19" w15:restartNumberingAfterBreak="0">
+    <w:nsid w:val="645B3BAE"/>
+    <w:multiLevelType w:val="multilevel"/>
+    <w:tmpl w:val="8A464AA6"/>
+    <w:lvl w:ilvl="0">
+      <w:start w:val="1"/>
+      <w:numFmt w:val="decimal"/>
+      <w:lvlText w:val="%1."/>
+      <w:lvlJc w:val="left"/>
+      <w:pPr>
+        <w:tabs>
+          <w:tab w:val="num" w:pos="720"/>
+        </w:tabs>
+        <w:ind w:left="720" w:hanging="360"/>
+      </w:pPr>
+    </w:lvl>
+    <w:lvl w:ilvl="1" w:tentative="1">
+      <w:start w:val="1"/>
+      <w:numFmt w:val="decimal"/>
+      <w:lvlText w:val="%2."/>
+      <w:lvlJc w:val="left"/>
+      <w:pPr>
+        <w:tabs>
+          <w:tab w:val="num" w:pos="1440"/>
+        </w:tabs>
+        <w:ind w:left="1440" w:hanging="360"/>
+      </w:pPr>
+    </w:lvl>
+    <w:lvl w:ilvl="2" w:tentative="1">
+      <w:start w:val="1"/>
+      <w:numFmt w:val="decimal"/>
+      <w:lvlText w:val="%3."/>
+      <w:lvlJc w:val="left"/>
+      <w:pPr>
+        <w:tabs>
+          <w:tab w:val="num" w:pos="2160"/>
+        </w:tabs>
+        <w:ind w:left="2160" w:hanging="360"/>
+      </w:pPr>
+    </w:lvl>
+    <w:lvl w:ilvl="3" w:tentative="1">
+      <w:start w:val="1"/>
+      <w:numFmt w:val="decimal"/>
+      <w:lvlText w:val="%4."/>
+      <w:lvlJc w:val="left"/>
+      <w:pPr>
+        <w:tabs>
+          <w:tab w:val="num" w:pos="2880"/>
+        </w:tabs>
+        <w:ind w:left="2880" w:hanging="360"/>
+      </w:pPr>
+    </w:lvl>
+    <w:lvl w:ilvl="4" w:tentative="1">
+      <w:start w:val="1"/>
+      <w:numFmt w:val="decimal"/>
+      <w:lvlText w:val="%5."/>
+      <w:lvlJc w:val="left"/>
+      <w:pPr>
+        <w:tabs>
+          <w:tab w:val="num" w:pos="3600"/>
+        </w:tabs>
+        <w:ind w:left="3600" w:hanging="360"/>
+      </w:pPr>
+    </w:lvl>
+    <w:lvl w:ilvl="5" w:tentative="1">
+      <w:start w:val="1"/>
+      <w:numFmt w:val="decimal"/>
+      <w:lvlText w:val="%6."/>
+      <w:lvlJc w:val="left"/>
+      <w:pPr>
+        <w:tabs>
+          <w:tab w:val="num" w:pos="4320"/>
+        </w:tabs>
+        <w:ind w:left="4320" w:hanging="360"/>
+      </w:pPr>
+    </w:lvl>
+    <w:lvl w:ilvl="6" w:tentative="1">
+      <w:start w:val="1"/>
+      <w:numFmt w:val="decimal"/>
+      <w:lvlText w:val="%7."/>
+      <w:lvlJc w:val="left"/>
+      <w:pPr>
+        <w:tabs>
+          <w:tab w:val="num" w:pos="5040"/>
+        </w:tabs>
+        <w:ind w:left="5040" w:hanging="360"/>
+      </w:pPr>
+    </w:lvl>
+    <w:lvl w:ilvl="7" w:tentative="1">
+      <w:start w:val="1"/>
+      <w:numFmt w:val="decimal"/>
+      <w:lvlText w:val="%8."/>
+      <w:lvlJc w:val="left"/>
+      <w:pPr>
+        <w:tabs>
+          <w:tab w:val="num" w:pos="5760"/>
+        </w:tabs>
+        <w:ind w:left="5760" w:hanging="360"/>
+      </w:pPr>
+    </w:lvl>
+    <w:lvl w:ilvl="8" w:tentative="1">
+      <w:start w:val="1"/>
+      <w:numFmt w:val="decimal"/>
+      <w:lvlText w:val="%9."/>
+      <w:lvlJc w:val="left"/>
+      <w:pPr>
+        <w:tabs>
+          <w:tab w:val="num" w:pos="6480"/>
+        </w:tabs>
+        <w:ind w:left="6480" w:hanging="360"/>
+      </w:pPr>
+    </w:lvl>
+  </w:abstractNum>
+  <w:abstractNum w:abstractNumId="20" w15:restartNumberingAfterBreak="0">
     <w:nsid w:val="676A10F5"/>
     <w:multiLevelType w:val="multilevel"/>
     <w:tmpl w:val="59800752"/>
@@ -7920,7 +9367,7 @@
       </w:rPr>
     </w:lvl>
   </w:abstractNum>
-  <w:abstractNum w:abstractNumId="16" w15:restartNumberingAfterBreak="0">
+  <w:abstractNum w:abstractNumId="21" w15:restartNumberingAfterBreak="0">
     <w:nsid w:val="679E5912"/>
     <w:multiLevelType w:val="multilevel"/>
     <w:tmpl w:val="B7C8246A"/>
@@ -8069,7 +9516,7 @@
       </w:rPr>
     </w:lvl>
   </w:abstractNum>
-  <w:abstractNum w:abstractNumId="17" w15:restartNumberingAfterBreak="0">
+  <w:abstractNum w:abstractNumId="22" w15:restartNumberingAfterBreak="0">
     <w:nsid w:val="7B8310CF"/>
     <w:multiLevelType w:val="multilevel"/>
     <w:tmpl w:val="0868003C"/>
@@ -8218,7 +9665,7 @@
       </w:rPr>
     </w:lvl>
   </w:abstractNum>
-  <w:abstractNum w:abstractNumId="18" w15:restartNumberingAfterBreak="0">
+  <w:abstractNum w:abstractNumId="23" w15:restartNumberingAfterBreak="0">
     <w:nsid w:val="7F203B83"/>
     <w:multiLevelType w:val="multilevel"/>
     <w:tmpl w:val="A6E41480"/>
@@ -8404,55 +9851,70 @@
     <w:abstractNumId w:val="1"/>
   </w:num>
   <w:num w:numId="13" w16cid:durableId="1440565428">
+    <w:abstractNumId w:val="18"/>
+  </w:num>
+  <w:num w:numId="14" w16cid:durableId="1003781136">
+    <w:abstractNumId w:val="21"/>
+  </w:num>
+  <w:num w:numId="15" w16cid:durableId="430203777">
+    <w:abstractNumId w:val="10"/>
+  </w:num>
+  <w:num w:numId="16" w16cid:durableId="1152405387">
+    <w:abstractNumId w:val="7"/>
+  </w:num>
+  <w:num w:numId="17" w16cid:durableId="1096288806">
+    <w:abstractNumId w:val="11"/>
+  </w:num>
+  <w:num w:numId="18" w16cid:durableId="764307916">
+    <w:abstractNumId w:val="22"/>
+  </w:num>
+  <w:num w:numId="19" w16cid:durableId="1148984826">
+    <w:abstractNumId w:val="4"/>
+  </w:num>
+  <w:num w:numId="20" w16cid:durableId="546838458">
+    <w:abstractNumId w:val="12"/>
+  </w:num>
+  <w:num w:numId="21" w16cid:durableId="511451556">
+    <w:abstractNumId w:val="17"/>
+  </w:num>
+  <w:num w:numId="22" w16cid:durableId="1184319631">
     <w:abstractNumId w:val="14"/>
   </w:num>
-  <w:num w:numId="14" w16cid:durableId="1003781136">
-    <w:abstractNumId w:val="16"/>
+  <w:num w:numId="23" w16cid:durableId="502865332">
+    <w:abstractNumId w:val="8"/>
   </w:num>
-  <w:num w:numId="15" w16cid:durableId="430203777">
-    <w:abstractNumId w:val="7"/>
+  <w:num w:numId="24" w16cid:durableId="972100780">
+    <w:abstractNumId w:val="13"/>
   </w:num>
-  <w:num w:numId="16" w16cid:durableId="1152405387">
+  <w:num w:numId="25" w16cid:durableId="257178618">
+    <w:abstractNumId w:val="6"/>
+  </w:num>
+  <w:num w:numId="26" w16cid:durableId="399669392">
     <w:abstractNumId w:val="5"/>
   </w:num>
-  <w:num w:numId="17" w16cid:durableId="1096288806">
-    <w:abstractNumId w:val="8"/>
+  <w:num w:numId="27" w16cid:durableId="1855536517">
+    <w:abstractNumId w:val="23"/>
   </w:num>
-  <w:num w:numId="18" w16cid:durableId="764307916">
-    <w:abstractNumId w:val="17"/>
+  <w:num w:numId="28" w16cid:durableId="309751500">
+    <w:abstractNumId w:val="20"/>
   </w:num>
-  <w:num w:numId="19" w16cid:durableId="1148984826">
+  <w:num w:numId="29" w16cid:durableId="113986904">
+    <w:abstractNumId w:val="15"/>
+  </w:num>
+  <w:num w:numId="30" w16cid:durableId="1761103132">
+    <w:abstractNumId w:val="9"/>
+  </w:num>
+  <w:num w:numId="31" w16cid:durableId="189228464">
+    <w:abstractNumId w:val="19"/>
+  </w:num>
+  <w:num w:numId="32" w16cid:durableId="2120492057">
+    <w:abstractNumId w:val="3"/>
+  </w:num>
+  <w:num w:numId="33" w16cid:durableId="1698045572">
     <w:abstractNumId w:val="2"/>
   </w:num>
-  <w:num w:numId="20" w16cid:durableId="546838458">
-    <w:abstractNumId w:val="9"/>
-  </w:num>
-  <w:num w:numId="21" w16cid:durableId="511451556">
-    <w:abstractNumId w:val="13"/>
-  </w:num>
-  <w:num w:numId="22" w16cid:durableId="1184319631">
-    <w:abstractNumId w:val="11"/>
-  </w:num>
-  <w:num w:numId="23" w16cid:durableId="502865332">
-    <w:abstractNumId w:val="6"/>
-  </w:num>
-  <w:num w:numId="24" w16cid:durableId="972100780">
-    <w:abstractNumId w:val="10"/>
-  </w:num>
-  <w:num w:numId="25" w16cid:durableId="257178618">
-    <w:abstractNumId w:val="4"/>
-  </w:num>
-  <w:num w:numId="26" w16cid:durableId="399669392">
-    <w:abstractNumId w:val="3"/>
-  </w:num>
-  <w:num w:numId="27" w16cid:durableId="1855536517">
-    <w:abstractNumId w:val="18"/>
-  </w:num>
-  <w:num w:numId="28" w16cid:durableId="309751500">
-    <w:abstractNumId w:val="15"/>
-  </w:num>
-  <w:num w:numId="29" w16cid:durableId="113986904">
-    <w:abstractNumId w:val="12"/>
+  <w:num w:numId="34" w16cid:durableId="1543596089">
+    <w:abstractNumId w:val="16"/>
   </w:num>
 </w:numbering>
 </file>

</xml_diff>

<commit_message>
Update .gitignore to include __pycache__ directory and enhance documentation with UOM methods theory
</commit_message>
<xml_diff>
--- a/Documentation/MPPL Spec Doc.docx
+++ b/Documentation/MPPL Spec Doc.docx
@@ -1799,23 +1799,7 @@
           <w:b/>
           <w:bCs/>
         </w:rPr>
-        <w:t xml:space="preserve"> </w:t>
-      </w:r>
-      <w:proofErr w:type="spellStart"/>
-      <w:r>
-        <w:rPr>
-          <w:b/>
-          <w:bCs/>
-        </w:rPr>
-        <w:t>Mapple</w:t>
-      </w:r>
-      <w:proofErr w:type="spellEnd"/>
-      <w:r>
-        <w:rPr>
-          <w:b/>
-          <w:bCs/>
-        </w:rPr>
-        <w:t xml:space="preserve"> (MPPL) Formal Specification v0.4</w:t>
+        <w:t xml:space="preserve"> Mapple (MPPL) Formal Specification v0.4</w:t>
       </w:r>
     </w:p>
     <w:p>
@@ -1933,23 +1917,7 @@
         <w:t>Functions</w:t>
       </w:r>
       <w:r>
-        <w:t xml:space="preserve">: Declared as </w:t>
-      </w:r>
-      <w:proofErr w:type="spellStart"/>
-      <w:r>
-        <w:t>func</w:t>
-      </w:r>
-      <w:proofErr w:type="spellEnd"/>
-      <w:r>
-        <w:t xml:space="preserve"> &lt;name&gt;([params]): and closed with a </w:t>
-      </w:r>
-      <w:proofErr w:type="gramStart"/>
-      <w:r>
-        <w:t>single ;</w:t>
-      </w:r>
-      <w:proofErr w:type="gramEnd"/>
-      <w:r>
-        <w:t xml:space="preserve"> on its own line. </w:t>
+        <w:t xml:space="preserve">: Declared as func &lt;name&gt;([params]): and closed with a single ; on its own line. </w:t>
       </w:r>
     </w:p>
     <w:p>
@@ -1968,23 +1936,7 @@
         <w:t>Classes</w:t>
       </w:r>
       <w:r>
-        <w:t>: Declared as class &lt;name</w:t>
-      </w:r>
-      <w:proofErr w:type="gramStart"/>
-      <w:r>
-        <w:t>&gt;::</w:t>
-      </w:r>
-      <w:proofErr w:type="gramEnd"/>
-      <w:r>
-        <w:t xml:space="preserve"> and closed with a </w:t>
-      </w:r>
-      <w:proofErr w:type="gramStart"/>
-      <w:r>
-        <w:t>double ;</w:t>
-      </w:r>
-      <w:proofErr w:type="gramEnd"/>
-      <w:r>
-        <w:t xml:space="preserve">; on its own line. </w:t>
+        <w:t xml:space="preserve">: Declared as class &lt;name&gt;:: and closed with a double ;; on its own line. </w:t>
       </w:r>
     </w:p>
     <w:p>
@@ -2205,15 +2157,7 @@
               <w:pStyle w:val="Compact"/>
             </w:pPr>
             <w:r>
-              <w:t xml:space="preserve">let, </w:t>
-            </w:r>
-            <w:proofErr w:type="spellStart"/>
-            <w:r>
-              <w:t>func</w:t>
-            </w:r>
-            <w:proofErr w:type="spellEnd"/>
-            <w:r>
-              <w:t>, class, print, input, return</w:t>
+              <w:t>let, func, class, print, input, return</w:t>
             </w:r>
           </w:p>
         </w:tc>
@@ -2861,15 +2805,7 @@
               <w:pStyle w:val="Compact"/>
             </w:pPr>
             <w:r>
-              <w:t xml:space="preserve">. (used for method calling like </w:t>
-            </w:r>
-            <w:proofErr w:type="spellStart"/>
-            <w:r>
-              <w:t>age.str</w:t>
-            </w:r>
-            <w:proofErr w:type="spellEnd"/>
-            <w:r>
-              <w:t>)</w:t>
+              <w:t>. (used for method calling like age.str)</w:t>
             </w:r>
           </w:p>
         </w:tc>
@@ -2941,15 +2877,7 @@
               <w:pStyle w:val="Compact"/>
             </w:pPr>
             <w:r>
-              <w:t>: (Function start)</w:t>
-            </w:r>
-            <w:proofErr w:type="gramStart"/>
-            <w:r>
-              <w:t>, :</w:t>
-            </w:r>
-            <w:proofErr w:type="gramEnd"/>
-            <w:r>
-              <w:t>: (Class start)</w:t>
+              <w:t>: (Function start), :: (Class start)</w:t>
             </w:r>
           </w:p>
         </w:tc>
@@ -3021,15 +2949,7 @@
               <w:pStyle w:val="Compact"/>
             </w:pPr>
             <w:r>
-              <w:t>; (Statement/Func end)</w:t>
-            </w:r>
-            <w:proofErr w:type="gramStart"/>
-            <w:r>
-              <w:t>, ;</w:t>
-            </w:r>
-            <w:proofErr w:type="gramEnd"/>
-            <w:r>
-              <w:t>; (Class end)</w:t>
+              <w:t>; (Statement/Func end), ;; (Class end)</w:t>
             </w:r>
           </w:p>
         </w:tc>
@@ -3113,7 +3033,7 @@
       </w:pPr>
       <w:r>
         <w:pict w14:anchorId="4C91FAB0">
-          <v:rect id="_x0000_i1031" style="width:0;height:1.5pt" o:hralign="center" o:hrstd="t" o:hr="t" fillcolor="#a0a0a0" stroked="f"/>
+          <v:rect id="_x0000_i1025" style="width:0;height:1.5pt" o:hralign="center" o:hrstd="t" o:hr="t" fillcolor="#a0a0a0" stroked="f"/>
         </w:pict>
       </w:r>
     </w:p>
@@ -3168,15 +3088,7 @@
         <w:t>Semicolon Handling</w:t>
       </w:r>
       <w:r>
-        <w:t xml:space="preserve">: When the Lexer sees </w:t>
-      </w:r>
-      <w:proofErr w:type="gramStart"/>
-      <w:r>
-        <w:t>a ;</w:t>
-      </w:r>
-      <w:proofErr w:type="gramEnd"/>
-      <w:r>
-        <w:t>, it must "peek" at the next character.</w:t>
+        <w:t>: When the Lexer sees a ;, it must "peek" at the next character.</w:t>
       </w:r>
     </w:p>
     <w:p>
@@ -3188,23 +3100,7 @@
         </w:numPr>
       </w:pPr>
       <w:r>
-        <w:t xml:space="preserve">If the next </w:t>
-      </w:r>
-      <w:proofErr w:type="gramStart"/>
-      <w:r>
-        <w:t>char</w:t>
-      </w:r>
-      <w:proofErr w:type="gramEnd"/>
-      <w:r>
-        <w:t xml:space="preserve"> </w:t>
-      </w:r>
-      <w:proofErr w:type="gramStart"/>
-      <w:r>
-        <w:t>is ;</w:t>
-      </w:r>
-      <w:proofErr w:type="gramEnd"/>
-      <w:r>
-        <w:t xml:space="preserve">, it combines them into a single </w:t>
+        <w:t xml:space="preserve">If the next char is ;, it combines them into a single </w:t>
       </w:r>
       <w:r>
         <w:rPr>
@@ -3214,15 +3110,7 @@
         <w:t>CLASS_END</w:t>
       </w:r>
       <w:r>
-        <w:t xml:space="preserve"> token </w:t>
-      </w:r>
-      <w:proofErr w:type="gramStart"/>
-      <w:r>
-        <w:t>(;;)</w:t>
-      </w:r>
-      <w:proofErr w:type="gramEnd"/>
-      <w:r>
-        <w:t>.</w:t>
+        <w:t xml:space="preserve"> token (;;).</w:t>
       </w:r>
     </w:p>
     <w:p>
@@ -3275,15 +3163,7 @@
         </w:numPr>
       </w:pPr>
       <w:r>
-        <w:t xml:space="preserve">If it hits </w:t>
-      </w:r>
-      <w:proofErr w:type="gramStart"/>
-      <w:r>
-        <w:t>a .</w:t>
-      </w:r>
-      <w:proofErr w:type="gramEnd"/>
-      <w:r>
-        <w:t>, it switches from INT_LIT to NUM_LIT.</w:t>
+        <w:t>If it hits a ., it switches from INT_LIT to NUM_LIT.</w:t>
       </w:r>
     </w:p>
     <w:p>
@@ -3312,15 +3192,7 @@
         <w:t>unless</w:t>
       </w:r>
       <w:r>
-        <w:t xml:space="preserve"> they are inside a STR_LIT or used to separate two identical symbols (</w:t>
-      </w:r>
-      <w:proofErr w:type="gramStart"/>
-      <w:r>
-        <w:t>like ;</w:t>
-      </w:r>
-      <w:proofErr w:type="gramEnd"/>
-      <w:r>
-        <w:t xml:space="preserve"> ;).</w:t>
+        <w:t xml:space="preserve"> they are inside a STR_LIT or used to separate two identical symbols (like ; ;).</w:t>
       </w:r>
     </w:p>
     <w:p>
@@ -3384,15 +3256,7 @@
         <w:pStyle w:val="Compact"/>
       </w:pPr>
       <w:r>
-        <w:t xml:space="preserve">Tokens are the smallest meaningful units of your code. </w:t>
-      </w:r>
-      <w:proofErr w:type="gramStart"/>
-      <w:r>
-        <w:t>The Lexer</w:t>
-      </w:r>
-      <w:proofErr w:type="gramEnd"/>
-      <w:r>
-        <w:t xml:space="preserve"> has already done the work of "reading" and "categorizing" your raw text into these units.</w:t>
+        <w:t>Tokens are the smallest meaningful units of your code. The Lexer has already done the work of "reading" and "categorizing" your raw text into these units.</w:t>
       </w:r>
     </w:p>
     <w:p>
@@ -3474,15 +3338,7 @@
         <w:t>Node</w:t>
       </w:r>
       <w:r>
-        <w:t xml:space="preserve"> is a container that holds a specific piece of logic or data. In </w:t>
-      </w:r>
-      <w:proofErr w:type="spellStart"/>
-      <w:r>
-        <w:t>Mapple</w:t>
-      </w:r>
-      <w:proofErr w:type="spellEnd"/>
-      <w:r>
-        <w:t>, we define different "classes" of nodes depending on what the code is doing.</w:t>
+        <w:t xml:space="preserve"> is a container that holds a specific piece of logic or data. In Mapple, we define different "classes" of nodes depending on what the code is doing.</w:t>
       </w:r>
     </w:p>
     <w:p>
@@ -3558,15 +3414,7 @@
         <w:t>Statement Node</w:t>
       </w:r>
       <w:r>
-        <w:t xml:space="preserve">: Stores </w:t>
-      </w:r>
-      <w:proofErr w:type="gramStart"/>
-      <w:r>
-        <w:t>a full</w:t>
-      </w:r>
-      <w:proofErr w:type="gramEnd"/>
-      <w:r>
-        <w:t xml:space="preserve"> instruction, like a let declaration or a print call.</w:t>
+        <w:t>: Stores a full instruction, like a let declaration or a print call.</w:t>
       </w:r>
     </w:p>
     <w:p>
@@ -3609,7 +3457,7 @@
       </w:pPr>
       <w:r>
         <w:pict w14:anchorId="2F3FFAD6">
-          <v:rect id="_x0000_i1051" style="width:0;height:1.5pt" o:hralign="center" o:hrstd="t" o:hr="t" fillcolor="#a0a0a0" stroked="f"/>
+          <v:rect id="_x0000_i1026" style="width:0;height:1.5pt" o:hralign="center" o:hrstd="t" o:hr="t" fillcolor="#a0a0a0" stroked="f"/>
         </w:pict>
       </w:r>
     </w:p>
@@ -3642,21 +3490,8 @@
         <w:pStyle w:val="Compact"/>
       </w:pPr>
       <w:r>
-        <w:t xml:space="preserve">Imagine the code: </w:t>
-      </w:r>
-      <w:proofErr w:type="gramStart"/>
-      <w:r>
-        <w:t>print(</w:t>
-      </w:r>
-      <w:proofErr w:type="gramEnd"/>
-      <w:r>
-        <w:t>5 + 10</w:t>
-      </w:r>
-      <w:proofErr w:type="gramStart"/>
-      <w:r>
-        <w:t>);</w:t>
-      </w:r>
-      <w:proofErr w:type="gramEnd"/>
+        <w:t>Imagine the code: print(5 + 10);</w:t>
+      </w:r>
     </w:p>
     <w:p>
       <w:pPr>
@@ -3711,15 +3546,7 @@
         <w:pStyle w:val="Compact"/>
       </w:pPr>
       <w:r>
-        <w:t xml:space="preserve">The Parser "groups" these beads into a hierarchy based on </w:t>
-      </w:r>
-      <w:proofErr w:type="spellStart"/>
-      <w:r>
-        <w:t>Mapple's</w:t>
-      </w:r>
-      <w:proofErr w:type="spellEnd"/>
-      <w:r>
-        <w:t xml:space="preserve"> rules:</w:t>
+        <w:t>The Parser "groups" these beads into a hierarchy based on Mapple's rules:</w:t>
       </w:r>
     </w:p>
     <w:p>
@@ -3735,15 +3562,7 @@
         <w:pStyle w:val="Compact"/>
       </w:pPr>
       <w:r>
-        <w:t xml:space="preserve">       </w:t>
-      </w:r>
-      <w:proofErr w:type="spellStart"/>
-      <w:r>
-        <w:t>PrintStatement</w:t>
-      </w:r>
-      <w:proofErr w:type="spellEnd"/>
-      <w:r>
-        <w:t xml:space="preserve"> (Node)</w:t>
+        <w:t xml:space="preserve">       PrintStatement (Node)</w:t>
       </w:r>
     </w:p>
     <w:p>
@@ -3759,15 +3578,7 @@
         <w:pStyle w:val="Compact"/>
       </w:pPr>
       <w:r>
-        <w:t xml:space="preserve">      </w:t>
-      </w:r>
-      <w:proofErr w:type="spellStart"/>
-      <w:r>
-        <w:t>AdditionExpression</w:t>
-      </w:r>
-      <w:proofErr w:type="spellEnd"/>
-      <w:r>
-        <w:t xml:space="preserve"> (Node)</w:t>
+        <w:t xml:space="preserve">      AdditionExpression (Node)</w:t>
       </w:r>
     </w:p>
     <w:p>
@@ -3783,15 +3594,7 @@
         <w:pStyle w:val="Compact"/>
       </w:pPr>
       <w:r>
-        <w:t xml:space="preserve">      5 (</w:t>
-      </w:r>
-      <w:proofErr w:type="gramStart"/>
-      <w:r>
-        <w:t>Node)  10</w:t>
-      </w:r>
-      <w:proofErr w:type="gramEnd"/>
-      <w:r>
-        <w:t xml:space="preserve"> (Node)</w:t>
+        <w:t xml:space="preserve">      5 (Node)  10 (Node)</w:t>
       </w:r>
     </w:p>
     <w:p>
@@ -3852,15 +3655,7 @@
         <w:t>Logic Validation</w:t>
       </w:r>
       <w:r>
-        <w:t xml:space="preserve">: If the Parser sees let int </w:t>
-      </w:r>
-      <w:proofErr w:type="gramStart"/>
-      <w:r>
-        <w:t>= ;</w:t>
-      </w:r>
-      <w:proofErr w:type="gramEnd"/>
-      <w:r>
-        <w:t>, it looks at its "Tree Rules" and realizes a name is missing between int and =. It can then throw a specific error.</w:t>
+        <w:t>: If the Parser sees let int = ;, it looks at its "Tree Rules" and realizes a name is missing between int and =. It can then throw a specific error.</w:t>
       </w:r>
     </w:p>
     <w:p>
@@ -3869,7 +3664,7 @@
       </w:pPr>
       <w:r>
         <w:pict w14:anchorId="4486C141">
-          <v:rect id="_x0000_i1052" style="width:0;height:1.5pt" o:hralign="center" o:hrstd="t" o:hr="t" fillcolor="#a0a0a0" stroked="f"/>
+          <v:rect id="_x0000_i1027" style="width:0;height:1.5pt" o:hralign="center" o:hrstd="t" o:hr="t" fillcolor="#a0a0a0" stroked="f"/>
         </w:pict>
       </w:r>
     </w:p>
@@ -3928,23 +3723,7 @@
           <w:b/>
           <w:bCs/>
         </w:rPr>
-        <w:t>The Manager (</w:t>
-      </w:r>
-      <w:proofErr w:type="spellStart"/>
-      <w:r>
-        <w:rPr>
-          <w:b/>
-          <w:bCs/>
-        </w:rPr>
-        <w:t>parse_statement</w:t>
-      </w:r>
-      <w:proofErr w:type="spellEnd"/>
-      <w:r>
-        <w:rPr>
-          <w:b/>
-          <w:bCs/>
-        </w:rPr>
-        <w:t>)</w:t>
+        <w:t>The Manager (parse_statement)</w:t>
       </w:r>
       <w:r>
         <w:t xml:space="preserve">: Looks at the first token. If it's let, he calls the </w:t>
@@ -3983,23 +3762,7 @@
           <w:b/>
           <w:bCs/>
         </w:rPr>
-        <w:t>The Output Expert (</w:t>
-      </w:r>
-      <w:proofErr w:type="spellStart"/>
-      <w:r>
-        <w:rPr>
-          <w:b/>
-          <w:bCs/>
-        </w:rPr>
-        <w:t>parse_print</w:t>
-      </w:r>
-      <w:proofErr w:type="spellEnd"/>
-      <w:r>
-        <w:rPr>
-          <w:b/>
-          <w:bCs/>
-        </w:rPr>
-        <w:t>)</w:t>
+        <w:t>The Output Expert (parse_print)</w:t>
       </w:r>
       <w:r>
         <w:t xml:space="preserve">: He knows a print statement </w:t>
@@ -4012,15 +3775,7 @@
         <w:t>must</w:t>
       </w:r>
       <w:r>
-        <w:t xml:space="preserve"> have </w:t>
-      </w:r>
-      <w:proofErr w:type="gramStart"/>
-      <w:r>
-        <w:t>( after</w:t>
-      </w:r>
-      <w:proofErr w:type="gramEnd"/>
-      <w:r>
-        <w:t xml:space="preserve"> it. He calls the </w:t>
+        <w:t xml:space="preserve"> have ( after it. He calls the </w:t>
       </w:r>
       <w:r>
         <w:rPr>
@@ -4046,39 +3801,10 @@
           <w:b/>
           <w:bCs/>
         </w:rPr>
-        <w:t>The Math Expert (</w:t>
-      </w:r>
-      <w:proofErr w:type="spellStart"/>
-      <w:r>
-        <w:rPr>
-          <w:b/>
-          <w:bCs/>
-        </w:rPr>
-        <w:t>parse_expression</w:t>
-      </w:r>
-      <w:proofErr w:type="spellEnd"/>
-      <w:r>
-        <w:rPr>
-          <w:b/>
-          <w:bCs/>
-        </w:rPr>
-        <w:t>)</w:t>
-      </w:r>
-      <w:r>
-        <w:t xml:space="preserve">: He looks for numbers and plus signs. He builds </w:t>
-      </w:r>
-      <w:proofErr w:type="gramStart"/>
-      <w:r>
-        <w:t xml:space="preserve">the </w:t>
-      </w:r>
-      <w:proofErr w:type="spellStart"/>
-      <w:r>
-        <w:t>AdditionNode</w:t>
-      </w:r>
-      <w:proofErr w:type="spellEnd"/>
-      <w:proofErr w:type="gramEnd"/>
-      <w:r>
-        <w:t xml:space="preserve"> and hands it back to the Output Expert.</w:t>
+        <w:t>The Math Expert (parse_expression)</w:t>
+      </w:r>
+      <w:r>
+        <w:t>: He looks for numbers and plus signs. He builds the AdditionNode and hands it back to the Output Expert.</w:t>
       </w:r>
     </w:p>
     <w:p>
@@ -4087,7 +3813,7 @@
       </w:pPr>
       <w:r>
         <w:pict w14:anchorId="00B0A878">
-          <v:rect id="_x0000_i1053" style="width:0;height:1.5pt" o:hralign="center" o:hrstd="t" o:hr="t" fillcolor="#a0a0a0" stroked="f"/>
+          <v:rect id="_x0000_i1028" style="width:0;height:1.5pt" o:hralign="center" o:hrstd="t" o:hr="t" fillcolor="#a0a0a0" stroked="f"/>
         </w:pict>
       </w:r>
     </w:p>
@@ -4208,17 +3934,8 @@
                 <w:b/>
                 <w:bCs/>
               </w:rPr>
-              <w:t xml:space="preserve">Purpose in </w:t>
+              <w:t>Purpose in Mapple</w:t>
             </w:r>
-            <w:proofErr w:type="spellStart"/>
-            <w:r>
-              <w:rPr>
-                <w:b/>
-                <w:bCs/>
-              </w:rPr>
-              <w:t>Mapple</w:t>
-            </w:r>
-            <w:proofErr w:type="spellEnd"/>
           </w:p>
         </w:tc>
       </w:tr>
@@ -4526,15 +4243,7 @@
         <w:pStyle w:val="Compact"/>
       </w:pPr>
       <w:r>
-        <w:t xml:space="preserve">We will create a new file: </w:t>
-      </w:r>
-      <w:proofErr w:type="spellStart"/>
-      <w:r>
-        <w:t>src</w:t>
-      </w:r>
-      <w:proofErr w:type="spellEnd"/>
-      <w:r>
-        <w:t>/ast_nodes.py.</w:t>
+        <w:t>We will create a new file: src/ast_nodes.py.</w:t>
       </w:r>
     </w:p>
     <w:p>
@@ -4543,7 +4252,7 @@
       </w:pPr>
       <w:r>
         <w:pict w14:anchorId="480F9D7B">
-          <v:rect id="_x0000_i1063" style="width:0;height:1.5pt" o:hralign="center" o:hrstd="t" o:hr="t" fillcolor="#a0a0a0" stroked="f"/>
+          <v:rect id="_x0000_i1029" style="width:0;height:1.5pt" o:hralign="center" o:hrstd="t" o:hr="t" fillcolor="#a0a0a0" stroked="f"/>
         </w:pict>
       </w:r>
     </w:p>
@@ -4586,15 +4295,7 @@
         <w:t>AST Node</w:t>
       </w:r>
       <w:r>
-        <w:t xml:space="preserve"> is a simple class. Because </w:t>
-      </w:r>
-      <w:proofErr w:type="spellStart"/>
-      <w:r>
-        <w:t>Mapple</w:t>
-      </w:r>
-      <w:proofErr w:type="spellEnd"/>
-      <w:r>
-        <w:t xml:space="preserve"> follows the </w:t>
+        <w:t xml:space="preserve"> is a simple class. Because Mapple follows the </w:t>
       </w:r>
       <w:r>
         <w:rPr>
@@ -4648,15 +4349,7 @@
         <w:pStyle w:val="Compact"/>
       </w:pPr>
       <w:r>
-        <w:t xml:space="preserve">Every node will </w:t>
-      </w:r>
-      <w:proofErr w:type="gramStart"/>
-      <w:r>
-        <w:t>inherit</w:t>
-      </w:r>
-      <w:proofErr w:type="gramEnd"/>
-      <w:r>
-        <w:t xml:space="preserve"> from a base Node class. This allows the compiler to treat any part of the tree as a generic "piece of code".</w:t>
+        <w:t>Every node will inherit from a base Node class. This allows the compiler to treat any part of the tree as a generic "piece of code".</w:t>
       </w:r>
     </w:p>
     <w:p>
@@ -4691,7 +4384,6 @@
           <w:numId w:val="23"/>
         </w:numPr>
       </w:pPr>
-      <w:proofErr w:type="spellStart"/>
       <w:r>
         <w:rPr>
           <w:b/>
@@ -4699,7 +4391,6 @@
         </w:rPr>
         <w:t>LiteralNode</w:t>
       </w:r>
-      <w:proofErr w:type="spellEnd"/>
       <w:r>
         <w:t>: Holds a constant value (e.g., 10 or "Mukona").</w:t>
       </w:r>
@@ -4712,7 +4403,6 @@
           <w:numId w:val="23"/>
         </w:numPr>
       </w:pPr>
-      <w:proofErr w:type="spellStart"/>
       <w:r>
         <w:rPr>
           <w:b/>
@@ -4720,7 +4410,6 @@
         </w:rPr>
         <w:t>VarAccessNode</w:t>
       </w:r>
-      <w:proofErr w:type="spellEnd"/>
       <w:r>
         <w:t>: Holds the name of a variable being used (e.g., age).</w:t>
       </w:r>
@@ -4733,7 +4422,6 @@
           <w:numId w:val="23"/>
         </w:numPr>
       </w:pPr>
-      <w:proofErr w:type="spellStart"/>
       <w:r>
         <w:rPr>
           <w:b/>
@@ -4741,7 +4429,6 @@
         </w:rPr>
         <w:t>BinaryOpNode</w:t>
       </w:r>
-      <w:proofErr w:type="spellEnd"/>
       <w:r>
         <w:t>: Holds an operation (like +) and has a left and right child.</w:t>
       </w:r>
@@ -4778,7 +4465,6 @@
           <w:numId w:val="24"/>
         </w:numPr>
       </w:pPr>
-      <w:proofErr w:type="spellStart"/>
       <w:r>
         <w:rPr>
           <w:b/>
@@ -4786,17 +4472,8 @@
         </w:rPr>
         <w:t>VarDeclNode</w:t>
       </w:r>
-      <w:proofErr w:type="spellEnd"/>
-      <w:r>
-        <w:t xml:space="preserve">: A declaration like let int x = </w:t>
-      </w:r>
-      <w:proofErr w:type="gramStart"/>
-      <w:r>
-        <w:t>5;.</w:t>
-      </w:r>
-      <w:proofErr w:type="gramEnd"/>
-      <w:r>
-        <w:t xml:space="preserve"> It needs to store the </w:t>
+      <w:r>
+        <w:t xml:space="preserve">: A declaration like let int x = 5;. It needs to store the </w:t>
       </w:r>
       <w:r>
         <w:rPr>
@@ -4837,7 +4514,6 @@
           <w:numId w:val="24"/>
         </w:numPr>
       </w:pPr>
-      <w:proofErr w:type="spellStart"/>
       <w:r>
         <w:rPr>
           <w:b/>
@@ -4845,7 +4521,6 @@
         </w:rPr>
         <w:t>PrintNode</w:t>
       </w:r>
-      <w:proofErr w:type="spellEnd"/>
       <w:r>
         <w:t>: Holds the expression that needs to be printed.</w:t>
       </w:r>
@@ -4885,7 +4560,7 @@
       </w:pPr>
       <w:r>
         <w:pict w14:anchorId="21C083A1">
-          <v:rect id="_x0000_i1083" style="width:0;height:1.5pt" o:hralign="center" o:hrstd="t" o:hr="t" fillcolor="#a0a0a0" stroked="f"/>
+          <v:rect id="_x0000_i1030" style="width:0;height:1.5pt" o:hralign="center" o:hrstd="t" o:hr="t" fillcolor="#a0a0a0" stroked="f"/>
         </w:pict>
       </w:r>
     </w:p>
@@ -4944,15 +4619,7 @@
         <w:t>Program</w:t>
       </w:r>
       <w:r>
-        <w:t xml:space="preserve"> in </w:t>
-      </w:r>
-      <w:proofErr w:type="spellStart"/>
-      <w:r>
-        <w:t>Mapple</w:t>
-      </w:r>
-      <w:proofErr w:type="spellEnd"/>
-      <w:r>
-        <w:t xml:space="preserve"> is a list of statements that run one after another.</w:t>
+        <w:t xml:space="preserve"> in Mapple is a list of statements that run one after another.</w:t>
       </w:r>
     </w:p>
     <w:p>
@@ -5024,29 +4691,8 @@
         <w:t>Recipe</w:t>
       </w:r>
       <w:r>
-        <w:t xml:space="preserve">: Statement → </w:t>
-      </w:r>
-      <w:proofErr w:type="spellStart"/>
-      <w:r>
-        <w:t>VarDecl</w:t>
-      </w:r>
-      <w:proofErr w:type="spellEnd"/>
-      <w:r>
-        <w:t xml:space="preserve"> | </w:t>
-      </w:r>
-      <w:proofErr w:type="spellStart"/>
-      <w:r>
-        <w:t>PrintStmt</w:t>
-      </w:r>
-      <w:proofErr w:type="spellEnd"/>
-      <w:r>
-        <w:t xml:space="preserve"> | </w:t>
-      </w:r>
-      <w:proofErr w:type="spellStart"/>
-      <w:r>
-        <w:t>ExpressionStmt</w:t>
-      </w:r>
-      <w:proofErr w:type="spellEnd"/>
+        <w:t>: Statement → VarDecl | PrintStmt | ExpressionStmt</w:t>
+      </w:r>
     </w:p>
     <w:p>
       <w:pPr>
@@ -5088,15 +4734,7 @@
         <w:t>Recipe</w:t>
       </w:r>
       <w:r>
-        <w:t xml:space="preserve">: let + Type + Identifier + (= + Expression)? </w:t>
-      </w:r>
-      <w:proofErr w:type="gramStart"/>
-      <w:r>
-        <w:t>+ ;</w:t>
-      </w:r>
-      <w:proofErr w:type="gramEnd"/>
-      <w:r>
-        <w:t xml:space="preserve"> </w:t>
+        <w:t xml:space="preserve">: let + Type + Identifier + (= + Expression)? + ; </w:t>
       </w:r>
     </w:p>
     <w:p>
@@ -5139,23 +4777,7 @@
         <w:t>Recipe (Level 1 - Addition)</w:t>
       </w:r>
       <w:r>
-        <w:t xml:space="preserve">: Term </w:t>
-      </w:r>
-      <w:proofErr w:type="gramStart"/>
-      <w:r>
-        <w:t>( +</w:t>
-      </w:r>
-      <w:proofErr w:type="gramEnd"/>
-      <w:r>
-        <w:t xml:space="preserve"> | </w:t>
-      </w:r>
-      <w:proofErr w:type="gramStart"/>
-      <w:r>
-        <w:t>- )</w:t>
-      </w:r>
-      <w:proofErr w:type="gramEnd"/>
-      <w:r>
-        <w:t xml:space="preserve"> Term</w:t>
+        <w:t>: Term ( + | - ) Term</w:t>
       </w:r>
     </w:p>
     <w:p>
@@ -5174,23 +4796,7 @@
         <w:t>Recipe (Level 2 - Multiplication)</w:t>
       </w:r>
       <w:r>
-        <w:t xml:space="preserve">: Factor </w:t>
-      </w:r>
-      <w:proofErr w:type="gramStart"/>
-      <w:r>
-        <w:t>( *</w:t>
-      </w:r>
-      <w:proofErr w:type="gramEnd"/>
-      <w:r>
-        <w:t xml:space="preserve"> | </w:t>
-      </w:r>
-      <w:proofErr w:type="gramStart"/>
-      <w:r>
-        <w:t>/ )</w:t>
-      </w:r>
-      <w:proofErr w:type="gramEnd"/>
-      <w:r>
-        <w:t xml:space="preserve"> Factor</w:t>
+        <w:t>: Factor ( * | / ) Factor</w:t>
       </w:r>
     </w:p>
     <w:p>
@@ -5209,15 +4815,7 @@
         <w:t>Recipe (Level 3 - Factor)</w:t>
       </w:r>
       <w:r>
-        <w:t xml:space="preserve">: Number | String | Identifier | </w:t>
-      </w:r>
-      <w:proofErr w:type="gramStart"/>
-      <w:r>
-        <w:t>( Expression</w:t>
-      </w:r>
-      <w:proofErr w:type="gramEnd"/>
-      <w:r>
-        <w:t xml:space="preserve"> )</w:t>
+        <w:t>: Number | String | Identifier | ( Expression )</w:t>
       </w:r>
     </w:p>
     <w:p>
@@ -5226,7 +4824,7 @@
       </w:pPr>
       <w:r>
         <w:pict w14:anchorId="71866BC9">
-          <v:rect id="_x0000_i1084" style="width:0;height:1.5pt" o:hralign="center" o:hrstd="t" o:hr="t" fillcolor="#a0a0a0" stroked="f"/>
+          <v:rect id="_x0000_i1031" style="width:0;height:1.5pt" o:hralign="center" o:hrstd="t" o:hr="t" fillcolor="#a0a0a0" stroked="f"/>
         </w:pict>
       </w:r>
     </w:p>
@@ -5259,15 +4857,7 @@
         <w:pStyle w:val="Compact"/>
       </w:pPr>
       <w:r>
-        <w:t xml:space="preserve">When we code parser.py, we will create a class that tracks its current position </w:t>
-      </w:r>
-      <w:proofErr w:type="gramStart"/>
-      <w:r>
-        <w:t>in</w:t>
-      </w:r>
-      <w:proofErr w:type="gramEnd"/>
-      <w:r>
-        <w:t xml:space="preserve"> the </w:t>
+        <w:t xml:space="preserve">When we code parser.py, we will create a class that tracks its current position in the </w:t>
       </w:r>
       <w:r>
         <w:rPr>
@@ -5277,23 +4867,7 @@
         <w:t>Token List</w:t>
       </w:r>
       <w:r>
-        <w:t xml:space="preserve">. It uses a method called </w:t>
-      </w:r>
-      <w:proofErr w:type="gramStart"/>
-      <w:r>
-        <w:t>eat(</w:t>
-      </w:r>
-      <w:proofErr w:type="gramEnd"/>
-      <w:r>
-        <w:t xml:space="preserve">) (or </w:t>
-      </w:r>
-      <w:proofErr w:type="gramStart"/>
-      <w:r>
-        <w:t>match(</w:t>
-      </w:r>
-      <w:proofErr w:type="gramEnd"/>
-      <w:r>
-        <w:t>)).</w:t>
+        <w:t>. It uses a method called eat() (or match()).</w:t>
       </w:r>
     </w:p>
     <w:p>
@@ -5343,15 +4917,7 @@
         <w:t>Validation</w:t>
       </w:r>
       <w:r>
-        <w:t xml:space="preserve">: If the rule </w:t>
-      </w:r>
-      <w:proofErr w:type="gramStart"/>
-      <w:r>
-        <w:t>says</w:t>
-      </w:r>
-      <w:proofErr w:type="gramEnd"/>
-      <w:r>
-        <w:t xml:space="preserve"> "I need a TYPE here," and the token is INT_TYPE, the Parser is happy.</w:t>
+        <w:t>: If the rule says "I need a TYPE here," and the token is INT_TYPE, the Parser is happy.</w:t>
       </w:r>
     </w:p>
     <w:p>
@@ -5370,15 +4936,7 @@
         <w:t>Consumption</w:t>
       </w:r>
       <w:r>
-        <w:t xml:space="preserve">: </w:t>
-      </w:r>
-      <w:proofErr w:type="gramStart"/>
-      <w:r>
-        <w:t>It</w:t>
-      </w:r>
-      <w:proofErr w:type="gramEnd"/>
-      <w:r>
-        <w:t xml:space="preserve"> "eats" the token (moves to the next one) and continues building the </w:t>
+        <w:t xml:space="preserve">: It "eats" the token (moves to the next one) and continues building the </w:t>
       </w:r>
       <w:r>
         <w:rPr>
@@ -5426,7 +4984,7 @@
       </w:pPr>
       <w:r>
         <w:pict w14:anchorId="4CE1F5FB">
-          <v:rect id="_x0000_i1085" style="width:0;height:1.5pt" o:hralign="center" o:hrstd="t" o:hr="t" fillcolor="#a0a0a0" stroked="f"/>
+          <v:rect id="_x0000_i1032" style="width:0;height:1.5pt" o:hralign="center" o:hrstd="t" o:hr="t" fillcolor="#a0a0a0" stroked="f"/>
         </w:pict>
       </w:r>
     </w:p>
@@ -5756,42 +5314,22 @@
         <w:t>Abstract Syntax Tree (AST)</w:t>
       </w:r>
       <w:r>
-        <w:t xml:space="preserve"> to visit every node in a specific order. Since your AST is a hierarchy, we can't just read it left-to-right like a list; we </w:t>
-      </w:r>
-      <w:proofErr w:type="gramStart"/>
-      <w:r>
-        <w:t>have to</w:t>
-      </w:r>
-      <w:proofErr w:type="gramEnd"/>
-      <w:r>
-        <w:t xml:space="preserve"> travel up and down the branches to understand the relationships between the parts.</w:t>
-      </w:r>
-    </w:p>
-    <w:p>
-      <w:pPr>
-        <w:pStyle w:val="Compact"/>
-      </w:pPr>
-      <w:r>
-        <w:t xml:space="preserve">We use a technique called </w:t>
-      </w:r>
-      <w:proofErr w:type="gramStart"/>
-      <w:r>
-        <w:t xml:space="preserve">the </w:t>
-      </w:r>
-      <w:r>
-        <w:rPr>
-          <w:b/>
-          <w:bCs/>
-        </w:rPr>
-        <w:t>Visitor</w:t>
-      </w:r>
-      <w:proofErr w:type="gramEnd"/>
-      <w:r>
-        <w:rPr>
-          <w:b/>
-          <w:bCs/>
-        </w:rPr>
-        <w:t xml:space="preserve"> Pattern</w:t>
+        <w:t xml:space="preserve"> to visit every node in a specific order. Since your AST is a hierarchy, we can't just read it left-to-right like a list; we have to travel up and down the branches to understand the relationships between the parts.</w:t>
+      </w:r>
+    </w:p>
+    <w:p>
+      <w:pPr>
+        <w:pStyle w:val="Compact"/>
+      </w:pPr>
+      <w:r>
+        <w:t xml:space="preserve">We use a technique called the </w:t>
+      </w:r>
+      <w:r>
+        <w:rPr>
+          <w:b/>
+          <w:bCs/>
+        </w:rPr>
+        <w:t>Visitor Pattern</w:t>
       </w:r>
       <w:r>
         <w:t>.</w:t>
@@ -5803,7 +5341,7 @@
       </w:pPr>
       <w:r>
         <w:pict w14:anchorId="546913A1">
-          <v:rect id="_x0000_i1095" style="width:0;height:1.5pt" o:hralign="center" o:hrstd="t" o:hr="t" fillcolor="#a0a0a0" stroked="f"/>
+          <v:rect id="_x0000_i1033" style="width:0;height:1.5pt" o:hralign="center" o:hrstd="t" o:hr="t" fillcolor="#a0a0a0" stroked="f"/>
         </w:pict>
       </w:r>
     </w:p>
@@ -5882,23 +5420,7 @@
         <w:t>The AST (The City)</w:t>
       </w:r>
       <w:r>
-        <w:t xml:space="preserve">: It stays still. It contains "Landmarks" (Nodes like </w:t>
-      </w:r>
-      <w:proofErr w:type="spellStart"/>
-      <w:r>
-        <w:t>VarDecl</w:t>
-      </w:r>
-      <w:proofErr w:type="spellEnd"/>
-      <w:r>
-        <w:t xml:space="preserve">, Print, </w:t>
-      </w:r>
-      <w:proofErr w:type="spellStart"/>
-      <w:r>
-        <w:t>BinaryOp</w:t>
-      </w:r>
-      <w:proofErr w:type="spellEnd"/>
-      <w:r>
-        <w:t>).</w:t>
+        <w:t>: It stays still. It contains "Landmarks" (Nodes like VarDecl, Print, BinaryOp).</w:t>
       </w:r>
     </w:p>
     <w:p>
@@ -5963,33 +5485,8 @@
           <w:b/>
           <w:bCs/>
         </w:rPr>
-        <w:t xml:space="preserve">Example: </w:t>
-      </w:r>
-      <w:proofErr w:type="gramStart"/>
-      <w:r>
-        <w:rPr>
-          <w:b/>
-          <w:bCs/>
-        </w:rPr>
-        <w:t>print(</w:t>
-      </w:r>
-      <w:proofErr w:type="gramEnd"/>
-      <w:r>
-        <w:rPr>
-          <w:b/>
-          <w:bCs/>
-        </w:rPr>
-        <w:t>x + 5</w:t>
-      </w:r>
-      <w:proofErr w:type="gramStart"/>
-      <w:r>
-        <w:rPr>
-          <w:b/>
-          <w:bCs/>
-        </w:rPr>
-        <w:t>);</w:t>
-      </w:r>
-      <w:proofErr w:type="gramEnd"/>
+        <w:t>Example: print(x + 5);</w:t>
+      </w:r>
     </w:p>
     <w:p>
       <w:pPr>
@@ -6000,13 +5497,8 @@
         </w:numPr>
       </w:pPr>
       <w:r>
-        <w:t xml:space="preserve">The Visitor arrives at </w:t>
-      </w:r>
-      <w:proofErr w:type="gramStart"/>
-      <w:r>
-        <w:t xml:space="preserve">the </w:t>
-      </w:r>
-      <w:proofErr w:type="spellStart"/>
+        <w:t xml:space="preserve">The Visitor arrives at the </w:t>
+      </w:r>
       <w:r>
         <w:rPr>
           <w:b/>
@@ -6014,8 +5506,6 @@
         </w:rPr>
         <w:t>PrintNode</w:t>
       </w:r>
-      <w:proofErr w:type="spellEnd"/>
-      <w:proofErr w:type="gramEnd"/>
       <w:r>
         <w:t>.</w:t>
       </w:r>
@@ -6043,7 +5533,6 @@
       <w:r>
         <w:t xml:space="preserve">It moves down to the </w:t>
       </w:r>
-      <w:proofErr w:type="spellStart"/>
       <w:r>
         <w:rPr>
           <w:b/>
@@ -6051,7 +5540,6 @@
         </w:rPr>
         <w:t>BinaryOpNode</w:t>
       </w:r>
-      <w:proofErr w:type="spellEnd"/>
       <w:r>
         <w:t xml:space="preserve"> (+).</w:t>
       </w:r>
@@ -6079,7 +5567,6 @@
       <w:r>
         <w:t xml:space="preserve">It moves to the </w:t>
       </w:r>
-      <w:proofErr w:type="spellStart"/>
       <w:r>
         <w:rPr>
           <w:b/>
@@ -6087,7 +5574,6 @@
         </w:rPr>
         <w:t>VarAccessNode</w:t>
       </w:r>
-      <w:proofErr w:type="spellEnd"/>
       <w:r>
         <w:t xml:space="preserve"> (x). This is a leaf! It checks the </w:t>
       </w:r>
@@ -6111,13 +5597,8 @@
         </w:numPr>
       </w:pPr>
       <w:r>
-        <w:t xml:space="preserve">It moves to </w:t>
-      </w:r>
-      <w:proofErr w:type="gramStart"/>
-      <w:r>
-        <w:t xml:space="preserve">the </w:t>
-      </w:r>
-      <w:proofErr w:type="spellStart"/>
+        <w:t xml:space="preserve">It moves to the </w:t>
+      </w:r>
       <w:r>
         <w:rPr>
           <w:b/>
@@ -6125,8 +5606,6 @@
         </w:rPr>
         <w:t>LiteralNode</w:t>
       </w:r>
-      <w:proofErr w:type="spellEnd"/>
-      <w:proofErr w:type="gramEnd"/>
       <w:r>
         <w:t xml:space="preserve"> (5). This is a leaf! It confirms it's an int.</w:t>
       </w:r>
@@ -6164,7 +5643,6 @@
       <w:r>
         <w:t xml:space="preserve">Finally, it moves back to the </w:t>
       </w:r>
-      <w:proofErr w:type="spellStart"/>
       <w:r>
         <w:rPr>
           <w:b/>
@@ -6172,7 +5650,6 @@
         </w:rPr>
         <w:t>PrintNode</w:t>
       </w:r>
-      <w:proofErr w:type="spellEnd"/>
       <w:r>
         <w:t xml:space="preserve"> and says: "The logic inside is valid. I'm done."</w:t>
       </w:r>
@@ -6208,23 +5685,7 @@
           <w:b/>
           <w:bCs/>
         </w:rPr>
-        <w:t xml:space="preserve"> </w:t>
-      </w:r>
-      <w:proofErr w:type="spellStart"/>
-      <w:r>
-        <w:rPr>
-          <w:b/>
-          <w:bCs/>
-        </w:rPr>
-        <w:t>Mapple</w:t>
-      </w:r>
-      <w:proofErr w:type="spellEnd"/>
-      <w:r>
-        <w:rPr>
-          <w:b/>
-          <w:bCs/>
-        </w:rPr>
-        <w:t xml:space="preserve"> Type Rules (v0.1)</w:t>
+        <w:t xml:space="preserve"> Mapple Type Rules (v0.1)</w:t>
       </w:r>
     </w:p>
     <w:p>
@@ -6406,15 +5867,7 @@
         <w:t>Semantic Error</w:t>
       </w:r>
       <w:r>
-        <w:t xml:space="preserve"> unless the user explicitly casts it, such as </w:t>
-      </w:r>
-      <w:proofErr w:type="spellStart"/>
-      <w:r>
-        <w:t>a.num</w:t>
-      </w:r>
-      <w:proofErr w:type="spellEnd"/>
-      <w:r>
-        <w:t xml:space="preserve"> + b.</w:t>
+        <w:t xml:space="preserve"> unless the user explicitly casts it, such as a.num + b.</w:t>
       </w:r>
     </w:p>
     <w:p>
@@ -6468,15 +5921,69 @@
         <w:t>Type Match</w:t>
       </w:r>
       <w:r>
-        <w:t xml:space="preserve">: Both sides must be the same type. You cannot subtract a </w:t>
-      </w:r>
-      <w:proofErr w:type="gramStart"/>
-      <w:r>
-        <w:t>char</w:t>
-      </w:r>
-      <w:proofErr w:type="gramEnd"/>
-      <w:r>
-        <w:t xml:space="preserve"> from a str.</w:t>
+        <w:t>: Both sides must be the same type. You cannot subtract a char from a str.</w:t>
+      </w:r>
+    </w:p>
+    <w:p>
+      <w:pPr>
+        <w:pStyle w:val="Compact"/>
+      </w:pPr>
+    </w:p>
+    <w:p>
+      <w:pPr>
+        <w:pStyle w:val="Compact"/>
+      </w:pPr>
+    </w:p>
+    <w:p>
+      <w:pPr>
+        <w:pStyle w:val="Compact"/>
+        <w:rPr>
+          <w:b/>
+          <w:bCs/>
+        </w:rPr>
+      </w:pPr>
+      <w:r>
+        <w:rPr>
+          <w:rFonts w:ascii="Segoe UI Emoji" w:hAnsi="Segoe UI Emoji" w:cs="Segoe UI Emoji"/>
+          <w:b/>
+          <w:bCs/>
+        </w:rPr>
+        <w:t>📒</w:t>
+      </w:r>
+      <w:r>
+        <w:rPr>
+          <w:b/>
+          <w:bCs/>
+        </w:rPr>
+        <w:t xml:space="preserve"> Theory: Handling the UOM Methods</w:t>
+      </w:r>
+    </w:p>
+    <w:p>
+      <w:pPr>
+        <w:pStyle w:val="Compact"/>
+      </w:pPr>
+      <w:r>
+        <w:t xml:space="preserve">In a </w:t>
+      </w:r>
+      <w:r>
+        <w:rPr>
+          <w:b/>
+          <w:bCs/>
+        </w:rPr>
+        <w:t>Uniform Object Model (UOM)</w:t>
+      </w:r>
+      <w:r>
+        <w:t xml:space="preserve">, every type is technically an object. For v0.1, we don't need a complex inheritance system; we can simply define a </w:t>
+      </w:r>
+      <w:r>
+        <w:rPr>
+          <w:b/>
+          <w:bCs/>
+        </w:rPr>
+        <w:t>Method Map</w:t>
+      </w:r>
+      <w:r>
+        <w:t>. This tells the Analyzer that if it sees a .int access on a str, the result of that entire expression is an int.</w:t>
       </w:r>
     </w:p>
     <w:p>

</xml_diff>

<commit_message>
Add initial README.md with project overview and installation instructions
</commit_message>
<xml_diff>
--- a/Documentation/MPPL Spec Doc.docx
+++ b/Documentation/MPPL Spec Doc.docx
@@ -5990,6 +5990,113 @@
       <w:pPr>
         <w:pStyle w:val="Compact"/>
       </w:pPr>
+      <w:r>
+        <w:lastRenderedPageBreak/>
+        <w:t xml:space="preserve">document the </w:t>
+      </w:r>
+      <w:r>
+        <w:rPr>
+          <w:b/>
+          <w:bCs/>
+        </w:rPr>
+        <w:t>"Logic &amp; Control Flow"</w:t>
+      </w:r>
+      <w:r>
+        <w:t xml:space="preserve"> section you are about to build. This ensures the "Rules" are written down before the code is.</w:t>
+      </w:r>
+    </w:p>
+    <w:p>
+      <w:pPr>
+        <w:pStyle w:val="Compact"/>
+      </w:pPr>
+      <w:r>
+        <w:rPr>
+          <w:b/>
+          <w:bCs/>
+        </w:rPr>
+        <w:t>New Section for Spec: 11. Control Flow (v0.2 Preview)</w:t>
+      </w:r>
+    </w:p>
+    <w:p>
+      <w:pPr>
+        <w:pStyle w:val="Compact"/>
+        <w:numPr>
+          <w:ilvl w:val="0"/>
+          <w:numId w:val="35"/>
+        </w:numPr>
+      </w:pPr>
+      <w:r>
+        <w:rPr>
+          <w:b/>
+          <w:bCs/>
+        </w:rPr>
+        <w:t>Conditionals</w:t>
+      </w:r>
+      <w:r>
+        <w:t>: if (condition): [body] ;</w:t>
+      </w:r>
+    </w:p>
+    <w:p>
+      <w:pPr>
+        <w:pStyle w:val="Compact"/>
+        <w:numPr>
+          <w:ilvl w:val="0"/>
+          <w:numId w:val="35"/>
+        </w:numPr>
+      </w:pPr>
+      <w:r>
+        <w:rPr>
+          <w:b/>
+          <w:bCs/>
+        </w:rPr>
+        <w:t>Else Branch</w:t>
+      </w:r>
+      <w:r>
+        <w:t>: else: [body] ;</w:t>
+      </w:r>
+    </w:p>
+    <w:p>
+      <w:pPr>
+        <w:pStyle w:val="Compact"/>
+        <w:numPr>
+          <w:ilvl w:val="0"/>
+          <w:numId w:val="35"/>
+        </w:numPr>
+      </w:pPr>
+      <w:r>
+        <w:rPr>
+          <w:b/>
+          <w:bCs/>
+        </w:rPr>
+        <w:t>Loops</w:t>
+      </w:r>
+      <w:r>
+        <w:t>: while (condition): [body] ;</w:t>
+      </w:r>
+    </w:p>
+    <w:p>
+      <w:pPr>
+        <w:pStyle w:val="Compact"/>
+        <w:numPr>
+          <w:ilvl w:val="0"/>
+          <w:numId w:val="35"/>
+        </w:numPr>
+      </w:pPr>
+      <w:r>
+        <w:rPr>
+          <w:b/>
+          <w:bCs/>
+        </w:rPr>
+        <w:t>Logical Equality</w:t>
+      </w:r>
+      <w:r>
+        <w:t>: == (Check equality), != (Not equal), &gt; (Greater), &lt; (Less).</w:t>
+      </w:r>
+    </w:p>
+    <w:p>
+      <w:pPr>
+        <w:pStyle w:val="Compact"/>
+      </w:pPr>
     </w:p>
     <w:sectPr>
       <w:footnotePr>
@@ -8351,6 +8458,155 @@
     </w:lvl>
   </w:abstractNum>
   <w:abstractNum w:abstractNumId="17" w15:restartNumberingAfterBreak="0">
+    <w:nsid w:val="5A2A4046"/>
+    <w:multiLevelType w:val="multilevel"/>
+    <w:tmpl w:val="DE6A2C7C"/>
+    <w:lvl w:ilvl="0">
+      <w:start w:val="1"/>
+      <w:numFmt w:val="bullet"/>
+      <w:lvlText w:val=""/>
+      <w:lvlJc w:val="left"/>
+      <w:pPr>
+        <w:tabs>
+          <w:tab w:val="num" w:pos="720"/>
+        </w:tabs>
+        <w:ind w:left="720" w:hanging="360"/>
+      </w:pPr>
+      <w:rPr>
+        <w:rFonts w:ascii="Symbol" w:hAnsi="Symbol" w:hint="default"/>
+        <w:sz w:val="20"/>
+      </w:rPr>
+    </w:lvl>
+    <w:lvl w:ilvl="1" w:tentative="1">
+      <w:start w:val="1"/>
+      <w:numFmt w:val="bullet"/>
+      <w:lvlText w:val="o"/>
+      <w:lvlJc w:val="left"/>
+      <w:pPr>
+        <w:tabs>
+          <w:tab w:val="num" w:pos="1440"/>
+        </w:tabs>
+        <w:ind w:left="1440" w:hanging="360"/>
+      </w:pPr>
+      <w:rPr>
+        <w:rFonts w:ascii="Courier New" w:hAnsi="Courier New" w:hint="default"/>
+        <w:sz w:val="20"/>
+      </w:rPr>
+    </w:lvl>
+    <w:lvl w:ilvl="2" w:tentative="1">
+      <w:start w:val="1"/>
+      <w:numFmt w:val="bullet"/>
+      <w:lvlText w:val=""/>
+      <w:lvlJc w:val="left"/>
+      <w:pPr>
+        <w:tabs>
+          <w:tab w:val="num" w:pos="2160"/>
+        </w:tabs>
+        <w:ind w:left="2160" w:hanging="360"/>
+      </w:pPr>
+      <w:rPr>
+        <w:rFonts w:ascii="Wingdings" w:hAnsi="Wingdings" w:hint="default"/>
+        <w:sz w:val="20"/>
+      </w:rPr>
+    </w:lvl>
+    <w:lvl w:ilvl="3" w:tentative="1">
+      <w:start w:val="1"/>
+      <w:numFmt w:val="bullet"/>
+      <w:lvlText w:val=""/>
+      <w:lvlJc w:val="left"/>
+      <w:pPr>
+        <w:tabs>
+          <w:tab w:val="num" w:pos="2880"/>
+        </w:tabs>
+        <w:ind w:left="2880" w:hanging="360"/>
+      </w:pPr>
+      <w:rPr>
+        <w:rFonts w:ascii="Wingdings" w:hAnsi="Wingdings" w:hint="default"/>
+        <w:sz w:val="20"/>
+      </w:rPr>
+    </w:lvl>
+    <w:lvl w:ilvl="4" w:tentative="1">
+      <w:start w:val="1"/>
+      <w:numFmt w:val="bullet"/>
+      <w:lvlText w:val=""/>
+      <w:lvlJc w:val="left"/>
+      <w:pPr>
+        <w:tabs>
+          <w:tab w:val="num" w:pos="3600"/>
+        </w:tabs>
+        <w:ind w:left="3600" w:hanging="360"/>
+      </w:pPr>
+      <w:rPr>
+        <w:rFonts w:ascii="Wingdings" w:hAnsi="Wingdings" w:hint="default"/>
+        <w:sz w:val="20"/>
+      </w:rPr>
+    </w:lvl>
+    <w:lvl w:ilvl="5" w:tentative="1">
+      <w:start w:val="1"/>
+      <w:numFmt w:val="bullet"/>
+      <w:lvlText w:val=""/>
+      <w:lvlJc w:val="left"/>
+      <w:pPr>
+        <w:tabs>
+          <w:tab w:val="num" w:pos="4320"/>
+        </w:tabs>
+        <w:ind w:left="4320" w:hanging="360"/>
+      </w:pPr>
+      <w:rPr>
+        <w:rFonts w:ascii="Wingdings" w:hAnsi="Wingdings" w:hint="default"/>
+        <w:sz w:val="20"/>
+      </w:rPr>
+    </w:lvl>
+    <w:lvl w:ilvl="6" w:tentative="1">
+      <w:start w:val="1"/>
+      <w:numFmt w:val="bullet"/>
+      <w:lvlText w:val=""/>
+      <w:lvlJc w:val="left"/>
+      <w:pPr>
+        <w:tabs>
+          <w:tab w:val="num" w:pos="5040"/>
+        </w:tabs>
+        <w:ind w:left="5040" w:hanging="360"/>
+      </w:pPr>
+      <w:rPr>
+        <w:rFonts w:ascii="Wingdings" w:hAnsi="Wingdings" w:hint="default"/>
+        <w:sz w:val="20"/>
+      </w:rPr>
+    </w:lvl>
+    <w:lvl w:ilvl="7" w:tentative="1">
+      <w:start w:val="1"/>
+      <w:numFmt w:val="bullet"/>
+      <w:lvlText w:val=""/>
+      <w:lvlJc w:val="left"/>
+      <w:pPr>
+        <w:tabs>
+          <w:tab w:val="num" w:pos="5760"/>
+        </w:tabs>
+        <w:ind w:left="5760" w:hanging="360"/>
+      </w:pPr>
+      <w:rPr>
+        <w:rFonts w:ascii="Wingdings" w:hAnsi="Wingdings" w:hint="default"/>
+        <w:sz w:val="20"/>
+      </w:rPr>
+    </w:lvl>
+    <w:lvl w:ilvl="8" w:tentative="1">
+      <w:start w:val="1"/>
+      <w:numFmt w:val="bullet"/>
+      <w:lvlText w:val=""/>
+      <w:lvlJc w:val="left"/>
+      <w:pPr>
+        <w:tabs>
+          <w:tab w:val="num" w:pos="6480"/>
+        </w:tabs>
+        <w:ind w:left="6480" w:hanging="360"/>
+      </w:pPr>
+      <w:rPr>
+        <w:rFonts w:ascii="Wingdings" w:hAnsi="Wingdings" w:hint="default"/>
+        <w:sz w:val="20"/>
+      </w:rPr>
+    </w:lvl>
+  </w:abstractNum>
+  <w:abstractNum w:abstractNumId="18" w15:restartNumberingAfterBreak="0">
     <w:nsid w:val="5ECD26E2"/>
     <w:multiLevelType w:val="multilevel"/>
     <w:tmpl w:val="B35C5E7C"/>
@@ -8463,7 +8719,7 @@
       </w:pPr>
     </w:lvl>
   </w:abstractNum>
-  <w:abstractNum w:abstractNumId="18" w15:restartNumberingAfterBreak="0">
+  <w:abstractNum w:abstractNumId="19" w15:restartNumberingAfterBreak="0">
     <w:nsid w:val="629707BB"/>
     <w:multiLevelType w:val="multilevel"/>
     <w:tmpl w:val="A2EA769C"/>
@@ -8612,7 +8868,7 @@
       </w:rPr>
     </w:lvl>
   </w:abstractNum>
-  <w:abstractNum w:abstractNumId="19" w15:restartNumberingAfterBreak="0">
+  <w:abstractNum w:abstractNumId="20" w15:restartNumberingAfterBreak="0">
     <w:nsid w:val="645B3BAE"/>
     <w:multiLevelType w:val="multilevel"/>
     <w:tmpl w:val="8A464AA6"/>
@@ -8725,7 +8981,7 @@
       </w:pPr>
     </w:lvl>
   </w:abstractNum>
-  <w:abstractNum w:abstractNumId="20" w15:restartNumberingAfterBreak="0">
+  <w:abstractNum w:abstractNumId="21" w15:restartNumberingAfterBreak="0">
     <w:nsid w:val="676A10F5"/>
     <w:multiLevelType w:val="multilevel"/>
     <w:tmpl w:val="59800752"/>
@@ -8874,7 +9130,7 @@
       </w:rPr>
     </w:lvl>
   </w:abstractNum>
-  <w:abstractNum w:abstractNumId="21" w15:restartNumberingAfterBreak="0">
+  <w:abstractNum w:abstractNumId="22" w15:restartNumberingAfterBreak="0">
     <w:nsid w:val="679E5912"/>
     <w:multiLevelType w:val="multilevel"/>
     <w:tmpl w:val="B7C8246A"/>
@@ -9023,7 +9279,7 @@
       </w:rPr>
     </w:lvl>
   </w:abstractNum>
-  <w:abstractNum w:abstractNumId="22" w15:restartNumberingAfterBreak="0">
+  <w:abstractNum w:abstractNumId="23" w15:restartNumberingAfterBreak="0">
     <w:nsid w:val="7B8310CF"/>
     <w:multiLevelType w:val="multilevel"/>
     <w:tmpl w:val="0868003C"/>
@@ -9172,7 +9428,7 @@
       </w:rPr>
     </w:lvl>
   </w:abstractNum>
-  <w:abstractNum w:abstractNumId="23" w15:restartNumberingAfterBreak="0">
+  <w:abstractNum w:abstractNumId="24" w15:restartNumberingAfterBreak="0">
     <w:nsid w:val="7F203B83"/>
     <w:multiLevelType w:val="multilevel"/>
     <w:tmpl w:val="A6E41480"/>
@@ -9358,10 +9614,10 @@
     <w:abstractNumId w:val="1"/>
   </w:num>
   <w:num w:numId="13" w16cid:durableId="1440565428">
-    <w:abstractNumId w:val="18"/>
+    <w:abstractNumId w:val="19"/>
   </w:num>
   <w:num w:numId="14" w16cid:durableId="1003781136">
-    <w:abstractNumId w:val="21"/>
+    <w:abstractNumId w:val="22"/>
   </w:num>
   <w:num w:numId="15" w16cid:durableId="430203777">
     <w:abstractNumId w:val="10"/>
@@ -9373,7 +9629,7 @@
     <w:abstractNumId w:val="11"/>
   </w:num>
   <w:num w:numId="18" w16cid:durableId="764307916">
-    <w:abstractNumId w:val="22"/>
+    <w:abstractNumId w:val="23"/>
   </w:num>
   <w:num w:numId="19" w16cid:durableId="1148984826">
     <w:abstractNumId w:val="4"/>
@@ -9382,7 +9638,7 @@
     <w:abstractNumId w:val="12"/>
   </w:num>
   <w:num w:numId="21" w16cid:durableId="511451556">
-    <w:abstractNumId w:val="17"/>
+    <w:abstractNumId w:val="18"/>
   </w:num>
   <w:num w:numId="22" w16cid:durableId="1184319631">
     <w:abstractNumId w:val="14"/>
@@ -9400,10 +9656,10 @@
     <w:abstractNumId w:val="5"/>
   </w:num>
   <w:num w:numId="27" w16cid:durableId="1855536517">
-    <w:abstractNumId w:val="23"/>
+    <w:abstractNumId w:val="24"/>
   </w:num>
   <w:num w:numId="28" w16cid:durableId="309751500">
-    <w:abstractNumId w:val="20"/>
+    <w:abstractNumId w:val="21"/>
   </w:num>
   <w:num w:numId="29" w16cid:durableId="113986904">
     <w:abstractNumId w:val="15"/>
@@ -9412,7 +9668,7 @@
     <w:abstractNumId w:val="9"/>
   </w:num>
   <w:num w:numId="31" w16cid:durableId="189228464">
-    <w:abstractNumId w:val="19"/>
+    <w:abstractNumId w:val="20"/>
   </w:num>
   <w:num w:numId="32" w16cid:durableId="2120492057">
     <w:abstractNumId w:val="3"/>
@@ -9422,6 +9678,9 @@
   </w:num>
   <w:num w:numId="34" w16cid:durableId="1543596089">
     <w:abstractNumId w:val="16"/>
+  </w:num>
+  <w:num w:numId="35" w16cid:durableId="1944266986">
+    <w:abstractNumId w:val="17"/>
   </w:num>
 </w:numbering>
 </file>

</xml_diff>